<commit_message>
docs: update root CV docx document
</commit_message>
<xml_diff>
--- a/HAILEMARIAM_AGABZIE_HAILU_CV.docx
+++ b/HAILEMARIAM_AGABZIE_HAILU_CV.docx
@@ -4,66 +4,69 @@
   <w:body>
     <w:p>
       <w:pPr>
-        <w:spacing w:after="80"/>
+        <w:keepLines/>
+        <w:spacing w:after="20"/>
+        <w:jc w:val="center"/>
+      </w:pPr>
+      <w:r>
+        <w:rPr>
+          <w:b/>
+          <w:sz w:val="34"/>
+        </w:rPr>
+        <w:t>HAILEMARIAM AGABZIE HAILU</w:t>
+      </w:r>
+    </w:p>
+    <w:p>
+      <w:pPr>
+        <w:keepLines/>
+        <w:jc w:val="center"/>
+      </w:pPr>
+      <w:r>
+        <w:rPr>
+          <w:b/>
+          <w:sz w:val="21"/>
+        </w:rPr>
+        <w:t xml:space="preserve">FULL-STACK ENGINEER | </w:t>
+      </w:r>
+      <w:r>
+        <w:rPr>
+          <w:b/>
+          <w:sz w:val="21"/>
+        </w:rPr>
+        <w:t>Web, App</w:t>
+      </w:r>
+    </w:p>
+    <w:p>
+      <w:pPr>
+        <w:keepLines/>
+        <w:spacing w:after="60"/>
         <w:jc w:val="center"/>
         <w:rPr>
-          <w:rFonts w:ascii="Times New Roman" w:hAnsi="Times New Roman" w:cs="Times New Roman"/>
+          <w:color w:val="0284C7"/>
+          <w:u w:val="single"/>
         </w:rPr>
       </w:pPr>
       <w:r>
         <w:rPr>
-          <w:rFonts w:ascii="Times New Roman" w:hAnsi="Times New Roman" w:cs="Times New Roman"/>
-          <w:b/>
-          <w:sz w:val="48"/>
+          <w:noProof/>
         </w:rPr>
-        <w:t>HAILEMARIAM AGABZIE HAILU</w:t>
-      </w:r>
-    </w:p>
-    <w:p>
-      <w:pPr>
-        <w:spacing w:after="120"/>
-        <w:jc w:val="center"/>
-        <w:rPr>
-          <w:rFonts w:ascii="Times New Roman" w:hAnsi="Times New Roman" w:cs="Times New Roman"/>
-          <w:color w:val="C00000"/>
-        </w:rPr>
-      </w:pPr>
-      <w:r>
-        <w:rPr>
-          <w:rFonts w:ascii="Times New Roman" w:hAnsi="Times New Roman" w:cs="Times New Roman"/>
-          <w:b/>
-          <w:color w:val="C00000"/>
-          <w:sz w:val="26"/>
-        </w:rPr>
-        <w:t>Full-Stack Engineer | Web, App</w:t>
-      </w:r>
-    </w:p>
-    <w:p>
-      <w:pPr>
-        <w:spacing w:after="240"/>
-        <w:jc w:val="center"/>
-        <w:rPr>
-          <w:rFonts w:ascii="Times New Roman" w:hAnsi="Times New Roman" w:cs="Times New Roman"/>
-        </w:rPr>
-      </w:pPr>
-      <w:r/>
-      <w:r>
         <w:drawing>
-          <wp:inline xmlns:a="http://schemas.openxmlformats.org/drawingml/2006/main" xmlns:pic="http://schemas.openxmlformats.org/drawingml/2006/picture">
-            <wp:extent cx="139700" cy="139700"/>
+          <wp:inline distT="0" distB="0" distL="0" distR="0">
+            <wp:extent cx="133350" cy="133350"/>
+            <wp:effectExtent l="0" t="0" r="0" b="0"/>
             <wp:docPr id="1" name="Picture 1"/>
             <wp:cNvGraphicFramePr>
-              <a:graphicFrameLocks noChangeAspect="1"/>
+              <a:graphicFrameLocks xmlns:a="http://schemas.openxmlformats.org/drawingml/2006/main" noChangeAspect="1"/>
             </wp:cNvGraphicFramePr>
-            <a:graphic>
+            <a:graphic xmlns:a="http://schemas.openxmlformats.org/drawingml/2006/main">
               <a:graphicData uri="http://schemas.openxmlformats.org/drawingml/2006/picture">
-                <pic:pic>
+                <pic:pic xmlns:pic="http://schemas.openxmlformats.org/drawingml/2006/picture">
                   <pic:nvPicPr>
                     <pic:cNvPr id="0" name="email.png"/>
                     <pic:cNvPicPr/>
                   </pic:nvPicPr>
                   <pic:blipFill>
-                    <a:blip r:embed="rId15"/>
+                    <a:blip r:embed="rId8"/>
                     <a:stretch>
                       <a:fillRect/>
                     </a:stretch>
@@ -71,9 +74,11 @@
                   <pic:spPr>
                     <a:xfrm>
                       <a:off x="0" y="0"/>
-                      <a:ext cx="139700" cy="139700"/>
+                      <a:ext cx="133350" cy="133350"/>
                     </a:xfrm>
-                    <a:prstGeom prst="rect"/>
+                    <a:prstGeom prst="rect">
+                      <a:avLst/>
+                    </a:prstGeom>
                   </pic:spPr>
                 </pic:pic>
               </a:graphicData>
@@ -84,35 +89,42 @@
       <w:r>
         <w:t xml:space="preserve"> </w:t>
       </w:r>
-      <w:hyperlink r:id="rId16">
+      <w:hyperlink r:id="rId9">
         <w:r>
           <w:rPr>
-            <w:color w:val="0066CC"/>
+            <w:color w:val="0284C7"/>
             <w:u w:val="single"/>
           </w:rPr>
           <w:t>haileag8@gmail.com</w:t>
         </w:r>
       </w:hyperlink>
       <w:r>
-        <w:t xml:space="preserve">  |  </w:t>
-      </w:r>
-      <w:r>
+        <w:rPr>
+          <w:color w:val="4B5563"/>
+        </w:rPr>
+        <w:t xml:space="preserve">   |   </w:t>
+      </w:r>
+      <w:r>
+        <w:rPr>
+          <w:noProof/>
+        </w:rPr>
         <w:drawing>
-          <wp:inline xmlns:a="http://schemas.openxmlformats.org/drawingml/2006/main" xmlns:pic="http://schemas.openxmlformats.org/drawingml/2006/picture">
-            <wp:extent cx="139700" cy="139700"/>
+          <wp:inline distT="0" distB="0" distL="0" distR="0">
+            <wp:extent cx="133350" cy="133350"/>
+            <wp:effectExtent l="0" t="0" r="0" b="0"/>
             <wp:docPr id="2" name="Picture 2"/>
             <wp:cNvGraphicFramePr>
-              <a:graphicFrameLocks noChangeAspect="1"/>
+              <a:graphicFrameLocks xmlns:a="http://schemas.openxmlformats.org/drawingml/2006/main" noChangeAspect="1"/>
             </wp:cNvGraphicFramePr>
-            <a:graphic>
+            <a:graphic xmlns:a="http://schemas.openxmlformats.org/drawingml/2006/main">
               <a:graphicData uri="http://schemas.openxmlformats.org/drawingml/2006/picture">
-                <pic:pic>
+                <pic:pic xmlns:pic="http://schemas.openxmlformats.org/drawingml/2006/picture">
                   <pic:nvPicPr>
-                    <pic:cNvPr id="0" name="portfolio.png"/>
+                    <pic:cNvPr id="0" name="phone.png"/>
                     <pic:cNvPicPr/>
                   </pic:nvPicPr>
                   <pic:blipFill>
-                    <a:blip r:embed="rId17"/>
+                    <a:blip r:embed="rId10"/>
                     <a:stretch>
                       <a:fillRect/>
                     </a:stretch>
@@ -120,9 +132,11 @@
                   <pic:spPr>
                     <a:xfrm>
                       <a:off x="0" y="0"/>
-                      <a:ext cx="139700" cy="139700"/>
+                      <a:ext cx="133350" cy="133350"/>
                     </a:xfrm>
-                    <a:prstGeom prst="rect"/>
+                    <a:prstGeom prst="rect">
+                      <a:avLst/>
+                    </a:prstGeom>
                   </pic:spPr>
                 </pic:pic>
               </a:graphicData>
@@ -133,31 +147,212 @@
       <w:r>
         <w:t xml:space="preserve"> </w:t>
       </w:r>
-      <w:hyperlink r:id="rId8">
+      <w:hyperlink r:id="rId11">
         <w:r>
           <w:rPr>
-            <w:color w:val="0066CC"/>
+            <w:color w:val="0284C7"/>
+            <w:u w:val="single"/>
+          </w:rPr>
+          <w:t>+251900439121</w:t>
+        </w:r>
+      </w:hyperlink>
+      <w:r>
+        <w:rPr>
+          <w:color w:val="4B5563"/>
+        </w:rPr>
+        <w:t xml:space="preserve">   |   </w:t>
+      </w:r>
+      <w:r>
+        <w:rPr>
+          <w:noProof/>
+        </w:rPr>
+        <w:drawing>
+          <wp:inline distT="0" distB="0" distL="0" distR="0">
+            <wp:extent cx="133350" cy="133350"/>
+            <wp:effectExtent l="0" t="0" r="0" b="0"/>
+            <wp:docPr id="3" name="Picture 3"/>
+            <wp:cNvGraphicFramePr>
+              <a:graphicFrameLocks xmlns:a="http://schemas.openxmlformats.org/drawingml/2006/main" noChangeAspect="1"/>
+            </wp:cNvGraphicFramePr>
+            <a:graphic xmlns:a="http://schemas.openxmlformats.org/drawingml/2006/main">
+              <a:graphicData uri="http://schemas.openxmlformats.org/drawingml/2006/picture">
+                <pic:pic xmlns:pic="http://schemas.openxmlformats.org/drawingml/2006/picture">
+                  <pic:nvPicPr>
+                    <pic:cNvPr id="0" name="portfolio.png"/>
+                    <pic:cNvPicPr/>
+                  </pic:nvPicPr>
+                  <pic:blipFill>
+                    <a:blip r:embed="rId12"/>
+                    <a:stretch>
+                      <a:fillRect/>
+                    </a:stretch>
+                  </pic:blipFill>
+                  <pic:spPr>
+                    <a:xfrm>
+                      <a:off x="0" y="0"/>
+                      <a:ext cx="133350" cy="133350"/>
+                    </a:xfrm>
+                    <a:prstGeom prst="rect">
+                      <a:avLst/>
+                    </a:prstGeom>
+                  </pic:spPr>
+                </pic:pic>
+              </a:graphicData>
+            </a:graphic>
+          </wp:inline>
+        </w:drawing>
+      </w:r>
+      <w:r>
+        <w:t xml:space="preserve"> </w:t>
+      </w:r>
+      <w:hyperlink r:id="rId13">
+        <w:r>
+          <w:rPr>
+            <w:color w:val="0284C7"/>
             <w:u w:val="single"/>
           </w:rPr>
           <w:t>Portfolio</w:t>
         </w:r>
       </w:hyperlink>
       <w:r>
-        <w:t xml:space="preserve">  |  </w:t>
-      </w:r>
-      <w:r>
+        <w:rPr>
+          <w:color w:val="4B5563"/>
+        </w:rPr>
+        <w:t xml:space="preserve">   |   </w:t>
+      </w:r>
+      <w:r>
+        <w:rPr>
+          <w:noProof/>
+        </w:rPr>
         <w:drawing>
-          <wp:inline xmlns:a="http://schemas.openxmlformats.org/drawingml/2006/main" xmlns:pic="http://schemas.openxmlformats.org/drawingml/2006/picture">
-            <wp:extent cx="139700" cy="139700"/>
-            <wp:docPr id="3" name="Picture 3"/>
+          <wp:inline distT="0" distB="0" distL="0" distR="0">
+            <wp:extent cx="133350" cy="133350"/>
+            <wp:effectExtent l="0" t="0" r="0" b="0"/>
+            <wp:docPr id="4" name="Picture 4"/>
             <wp:cNvGraphicFramePr>
-              <a:graphicFrameLocks noChangeAspect="1"/>
+              <a:graphicFrameLocks xmlns:a="http://schemas.openxmlformats.org/drawingml/2006/main" noChangeAspect="1"/>
             </wp:cNvGraphicFramePr>
-            <a:graphic>
+            <a:graphic xmlns:a="http://schemas.openxmlformats.org/drawingml/2006/main">
               <a:graphicData uri="http://schemas.openxmlformats.org/drawingml/2006/picture">
-                <pic:pic>
+                <pic:pic xmlns:pic="http://schemas.openxmlformats.org/drawingml/2006/picture">
                   <pic:nvPicPr>
                     <pic:cNvPr id="0" name="github.png"/>
+                    <pic:cNvPicPr/>
+                  </pic:nvPicPr>
+                  <pic:blipFill>
+                    <a:blip r:embed="rId14"/>
+                    <a:stretch>
+                      <a:fillRect/>
+                    </a:stretch>
+                  </pic:blipFill>
+                  <pic:spPr>
+                    <a:xfrm>
+                      <a:off x="0" y="0"/>
+                      <a:ext cx="133350" cy="133350"/>
+                    </a:xfrm>
+                    <a:prstGeom prst="rect">
+                      <a:avLst/>
+                    </a:prstGeom>
+                  </pic:spPr>
+                </pic:pic>
+              </a:graphicData>
+            </a:graphic>
+          </wp:inline>
+        </w:drawing>
+      </w:r>
+      <w:r>
+        <w:t xml:space="preserve"> </w:t>
+      </w:r>
+      <w:hyperlink r:id="rId15">
+        <w:r>
+          <w:rPr>
+            <w:color w:val="0284C7"/>
+            <w:u w:val="single"/>
+          </w:rPr>
+          <w:t>GitHub</w:t>
+        </w:r>
+      </w:hyperlink>
+      <w:r>
+        <w:rPr>
+          <w:color w:val="4B5563"/>
+        </w:rPr>
+        <w:t xml:space="preserve">   |   </w:t>
+      </w:r>
+      <w:r>
+        <w:rPr>
+          <w:noProof/>
+        </w:rPr>
+        <w:drawing>
+          <wp:inline distT="0" distB="0" distL="0" distR="0">
+            <wp:extent cx="133350" cy="133350"/>
+            <wp:effectExtent l="0" t="0" r="0" b="0"/>
+            <wp:docPr id="5" name="Picture 5"/>
+            <wp:cNvGraphicFramePr>
+              <a:graphicFrameLocks xmlns:a="http://schemas.openxmlformats.org/drawingml/2006/main" noChangeAspect="1"/>
+            </wp:cNvGraphicFramePr>
+            <a:graphic xmlns:a="http://schemas.openxmlformats.org/drawingml/2006/main">
+              <a:graphicData uri="http://schemas.openxmlformats.org/drawingml/2006/picture">
+                <pic:pic xmlns:pic="http://schemas.openxmlformats.org/drawingml/2006/picture">
+                  <pic:nvPicPr>
+                    <pic:cNvPr id="0" name="linkedin.png"/>
+                    <pic:cNvPicPr/>
+                  </pic:nvPicPr>
+                  <pic:blipFill>
+                    <a:blip r:embed="rId16"/>
+                    <a:stretch>
+                      <a:fillRect/>
+                    </a:stretch>
+                  </pic:blipFill>
+                  <pic:spPr>
+                    <a:xfrm>
+                      <a:off x="0" y="0"/>
+                      <a:ext cx="133350" cy="133350"/>
+                    </a:xfrm>
+                    <a:prstGeom prst="rect">
+                      <a:avLst/>
+                    </a:prstGeom>
+                  </pic:spPr>
+                </pic:pic>
+              </a:graphicData>
+            </a:graphic>
+          </wp:inline>
+        </w:drawing>
+      </w:r>
+      <w:r>
+        <w:t xml:space="preserve"> </w:t>
+      </w:r>
+      <w:hyperlink r:id="rId17">
+        <w:r>
+          <w:rPr>
+            <w:color w:val="0284C7"/>
+            <w:u w:val="single"/>
+          </w:rPr>
+          <w:t>LinkedIn</w:t>
+        </w:r>
+      </w:hyperlink>
+      <w:r>
+        <w:rPr>
+          <w:color w:val="4B5563"/>
+        </w:rPr>
+        <w:t xml:space="preserve">   |   </w:t>
+      </w:r>
+      <w:r>
+        <w:rPr>
+          <w:noProof/>
+        </w:rPr>
+        <w:drawing>
+          <wp:inline distT="0" distB="0" distL="0" distR="0">
+            <wp:extent cx="133350" cy="133350"/>
+            <wp:effectExtent l="0" t="0" r="0" b="0"/>
+            <wp:docPr id="6" name="Picture 6"/>
+            <wp:cNvGraphicFramePr>
+              <a:graphicFrameLocks xmlns:a="http://schemas.openxmlformats.org/drawingml/2006/main" noChangeAspect="1"/>
+            </wp:cNvGraphicFramePr>
+            <a:graphic xmlns:a="http://schemas.openxmlformats.org/drawingml/2006/main">
+              <a:graphicData uri="http://schemas.openxmlformats.org/drawingml/2006/picture">
+                <pic:pic xmlns:pic="http://schemas.openxmlformats.org/drawingml/2006/picture">
+                  <pic:nvPicPr>
+                    <pic:cNvPr id="0" name="telegram.png"/>
                     <pic:cNvPicPr/>
                   </pic:nvPicPr>
                   <pic:blipFill>
@@ -169,9 +364,11 @@
                   <pic:spPr>
                     <a:xfrm>
                       <a:off x="0" y="0"/>
-                      <a:ext cx="139700" cy="139700"/>
+                      <a:ext cx="133350" cy="133350"/>
                     </a:xfrm>
-                    <a:prstGeom prst="rect"/>
+                    <a:prstGeom prst="rect">
+                      <a:avLst/>
+                    </a:prstGeom>
                   </pic:spPr>
                 </pic:pic>
               </a:graphicData>
@@ -182,108 +379,10 @@
       <w:r>
         <w:t xml:space="preserve"> </w:t>
       </w:r>
-      <w:hyperlink r:id="rId9">
+      <w:hyperlink r:id="rId19">
         <w:r>
           <w:rPr>
-            <w:color w:val="0066CC"/>
-            <w:u w:val="single"/>
-          </w:rPr>
-          <w:t>GitHub</w:t>
-        </w:r>
-      </w:hyperlink>
-      <w:r>
-        <w:t xml:space="preserve">  |  </w:t>
-      </w:r>
-      <w:r>
-        <w:drawing>
-          <wp:inline xmlns:a="http://schemas.openxmlformats.org/drawingml/2006/main" xmlns:pic="http://schemas.openxmlformats.org/drawingml/2006/picture">
-            <wp:extent cx="139700" cy="139700"/>
-            <wp:docPr id="4" name="Picture 4"/>
-            <wp:cNvGraphicFramePr>
-              <a:graphicFrameLocks noChangeAspect="1"/>
-            </wp:cNvGraphicFramePr>
-            <a:graphic>
-              <a:graphicData uri="http://schemas.openxmlformats.org/drawingml/2006/picture">
-                <pic:pic>
-                  <pic:nvPicPr>
-                    <pic:cNvPr id="0" name="linkedin.png"/>
-                    <pic:cNvPicPr/>
-                  </pic:nvPicPr>
-                  <pic:blipFill>
-                    <a:blip r:embed="rId19"/>
-                    <a:stretch>
-                      <a:fillRect/>
-                    </a:stretch>
-                  </pic:blipFill>
-                  <pic:spPr>
-                    <a:xfrm>
-                      <a:off x="0" y="0"/>
-                      <a:ext cx="139700" cy="139700"/>
-                    </a:xfrm>
-                    <a:prstGeom prst="rect"/>
-                  </pic:spPr>
-                </pic:pic>
-              </a:graphicData>
-            </a:graphic>
-          </wp:inline>
-        </w:drawing>
-      </w:r>
-      <w:r>
-        <w:t xml:space="preserve"> </w:t>
-      </w:r>
-      <w:hyperlink r:id="rId10">
-        <w:r>
-          <w:rPr>
-            <w:color w:val="0066CC"/>
-            <w:u w:val="single"/>
-          </w:rPr>
-          <w:t>LinkedIn</w:t>
-        </w:r>
-      </w:hyperlink>
-      <w:r>
-        <w:t xml:space="preserve">  |  </w:t>
-      </w:r>
-      <w:r>
-        <w:drawing>
-          <wp:inline xmlns:a="http://schemas.openxmlformats.org/drawingml/2006/main" xmlns:pic="http://schemas.openxmlformats.org/drawingml/2006/picture">
-            <wp:extent cx="139700" cy="139700"/>
-            <wp:docPr id="5" name="Picture 5"/>
-            <wp:cNvGraphicFramePr>
-              <a:graphicFrameLocks noChangeAspect="1"/>
-            </wp:cNvGraphicFramePr>
-            <a:graphic>
-              <a:graphicData uri="http://schemas.openxmlformats.org/drawingml/2006/picture">
-                <pic:pic>
-                  <pic:nvPicPr>
-                    <pic:cNvPr id="0" name="telegram.png"/>
-                    <pic:cNvPicPr/>
-                  </pic:nvPicPr>
-                  <pic:blipFill>
-                    <a:blip r:embed="rId20"/>
-                    <a:stretch>
-                      <a:fillRect/>
-                    </a:stretch>
-                  </pic:blipFill>
-                  <pic:spPr>
-                    <a:xfrm>
-                      <a:off x="0" y="0"/>
-                      <a:ext cx="139700" cy="139700"/>
-                    </a:xfrm>
-                    <a:prstGeom prst="rect"/>
-                  </pic:spPr>
-                </pic:pic>
-              </a:graphicData>
-            </a:graphic>
-          </wp:inline>
-        </w:drawing>
-      </w:r>
-      <w:r>
-        <w:t xml:space="preserve"> </w:t>
-      </w:r>
-      <w:hyperlink r:id="rId11">
-        <w:r>
-          <w:rPr>
-            <w:color w:val="0066CC"/>
+            <w:color w:val="0284C7"/>
             <w:u w:val="single"/>
           </w:rPr>
           <w:t>Telegram</w:t>
@@ -292,149 +391,1013 @@
     </w:p>
     <w:p>
       <w:pPr>
-        <w:spacing w:before="240" w:after="80"/>
+        <w:keepLines/>
+        <w:spacing w:after="60"/>
+        <w:jc w:val="center"/>
         <w:rPr>
-          <w:rFonts w:ascii="Times New Roman" w:hAnsi="Times New Roman" w:cs="Times New Roman"/>
+          <w:color w:val="0284C7"/>
+          <w:u w:val="single"/>
         </w:rPr>
       </w:pPr>
-      <w:r>
-        <w:rPr>
-          <w:rFonts w:ascii="Times New Roman" w:hAnsi="Times New Roman" w:cs="Times New Roman"/>
-          <w:b/>
-          <w:sz w:val="26"/>
-        </w:rPr>
-        <w:t>EXECUTIVE SUMMARY</w:t>
-      </w:r>
     </w:p>
     <w:p>
       <w:pPr>
-        <w:spacing w:after="120"/>
+        <w:keepLines/>
+        <w:spacing w:after="60"/>
+        <w:jc w:val="center"/>
+      </w:pPr>
+    </w:p>
+    <w:p>
+      <w:pPr>
+        <w:pStyle w:val="Heading1"/>
+      </w:pPr>
+      <w:r>
         <w:rPr>
-          <w:rFonts w:ascii="Times New Roman" w:hAnsi="Times New Roman" w:cs="Times New Roman"/>
+          <w:rFonts w:ascii="Arial" w:hAnsi="Arial"/>
         </w:rPr>
+        <w:t>PROFESSIONAL SUMMARY</w:t>
+      </w:r>
+    </w:p>
+    <w:p>
+      <w:pPr>
+        <w:keepLines/>
+        <w:spacing w:after="20"/>
       </w:pPr>
       <w:r>
         <w:rPr>
-          <w:rFonts w:ascii="Times New Roman" w:hAnsi="Times New Roman" w:cs="Times New Roman"/>
+          <w:sz w:val="10"/>
+        </w:rPr>
+        <w:t>───────────────────────────────────────────────────────────────────────────────────────────────────────────────────</w:t>
+      </w:r>
+      <w:r>
+        <w:rPr>
+          <w:sz w:val="10"/>
+        </w:rPr>
+        <w:t>───────────────────────────────</w:t>
+      </w:r>
+    </w:p>
+    <w:p>
+      <w:pPr>
+        <w:keepLines/>
+      </w:pPr>
+      <w:r>
+        <w:t xml:space="preserve">Full-Stack Engineer with 3+ years of hands-on experience in software development, designing, developing, testing, and deploying production web applications, RESTful APIs, and software platforms. Proficient in </w:t>
+      </w:r>
+      <w:proofErr w:type="spellStart"/>
+      <w:r>
+        <w:t>TypeScript</w:t>
+      </w:r>
+      <w:proofErr w:type="spellEnd"/>
+      <w:r>
+        <w:t xml:space="preserve">, JavaScript, Node.js, Express.js, React, Next.js, MySQL, PostgreSQL, REST APIs, authentication, RBAC, database design, and responsive UI development. Experienced in building enterprise operational systems, </w:t>
+      </w:r>
+      <w:proofErr w:type="spellStart"/>
+      <w:r>
+        <w:t>EdTech</w:t>
+      </w:r>
+      <w:proofErr w:type="spellEnd"/>
+      <w:r>
+        <w:t xml:space="preserve"> platforms, internship systems, AI-enabled applications, and internal knowledge platforms. Additional experience with Docker, AWS, </w:t>
+      </w:r>
+      <w:proofErr w:type="spellStart"/>
+      <w:r>
+        <w:t>WebSockets</w:t>
+      </w:r>
+      <w:proofErr w:type="spellEnd"/>
+      <w:r>
+        <w:t xml:space="preserve">, </w:t>
+      </w:r>
+      <w:proofErr w:type="spellStart"/>
+      <w:r>
+        <w:t>GraphQL</w:t>
+      </w:r>
+      <w:proofErr w:type="spellEnd"/>
+      <w:r>
+        <w:t>, Python, React Native, Flutter, Flask, and AI API integration.</w:t>
+      </w:r>
+    </w:p>
+    <w:p>
+      <w:pPr>
+        <w:pStyle w:val="Heading1"/>
+      </w:pPr>
+      <w:r>
+        <w:rPr>
+          <w:rFonts w:ascii="Arial" w:hAnsi="Arial"/>
+        </w:rPr>
+        <w:t>TECHNICAL SKILLS</w:t>
+      </w:r>
+    </w:p>
+    <w:p>
+      <w:pPr>
+        <w:keepLines/>
+        <w:spacing w:after="20"/>
+      </w:pPr>
+      <w:r>
+        <w:rPr>
+          <w:sz w:val="10"/>
+        </w:rPr>
+        <w:t>───────────────────────────────────────────────────────────────────────────────────────────────────────────────────</w:t>
+      </w:r>
+      <w:r>
+        <w:rPr>
+          <w:sz w:val="10"/>
+        </w:rPr>
+        <w:t>───────────────────────────────</w:t>
+      </w:r>
+    </w:p>
+    <w:p>
+      <w:pPr>
+        <w:keepLines/>
+      </w:pPr>
+      <w:r>
+        <w:rPr>
           <w:b/>
-          <w:bCs/>
+        </w:rPr>
+        <w:t xml:space="preserve">Languages: </w:t>
+      </w:r>
+      <w:proofErr w:type="spellStart"/>
+      <w:r>
+        <w:t>TypeScript</w:t>
+      </w:r>
+      <w:proofErr w:type="spellEnd"/>
+      <w:r>
+        <w:t>, JavaScript, Pyt</w:t>
+      </w:r>
+      <w:r>
+        <w:t>hon, C++, Dart, SQL</w:t>
+      </w:r>
+    </w:p>
+    <w:p>
+      <w:pPr>
+        <w:keepLines/>
+      </w:pPr>
+      <w:r>
+        <w:rPr>
+          <w:b/>
+        </w:rPr>
+        <w:t xml:space="preserve">Frontend: </w:t>
+      </w:r>
+      <w:r>
+        <w:t xml:space="preserve">React, Next.js, React Native, Flutter, Tailwind CSS, </w:t>
+      </w:r>
+      <w:proofErr w:type="spellStart"/>
+      <w:r>
+        <w:t>Zustand</w:t>
+      </w:r>
+      <w:proofErr w:type="spellEnd"/>
+      <w:r>
+        <w:t>, Framer Motion, Responsive UI, Accessible UI/UX</w:t>
+      </w:r>
+    </w:p>
+    <w:p>
+      <w:pPr>
+        <w:keepLines/>
+      </w:pPr>
+      <w:r>
+        <w:rPr>
+          <w:b/>
+        </w:rPr>
+        <w:t xml:space="preserve">Backend &amp; APIs: </w:t>
+      </w:r>
+      <w:r>
+        <w:t xml:space="preserve">Node.js, Express.js, RESTful APIs, </w:t>
+      </w:r>
+      <w:proofErr w:type="spellStart"/>
+      <w:r>
+        <w:t>WebSockets</w:t>
+      </w:r>
+      <w:proofErr w:type="spellEnd"/>
+      <w:r>
+        <w:t xml:space="preserve">, </w:t>
+      </w:r>
+      <w:proofErr w:type="spellStart"/>
+      <w:r>
+        <w:t>GraphQL</w:t>
+      </w:r>
+      <w:proofErr w:type="spellEnd"/>
+      <w:r>
+        <w:t xml:space="preserve">, Flask, </w:t>
+      </w:r>
+      <w:proofErr w:type="spellStart"/>
+      <w:r>
+        <w:t>Prisma</w:t>
+      </w:r>
+      <w:proofErr w:type="spellEnd"/>
+      <w:r>
+        <w:t xml:space="preserve"> ORM, </w:t>
+      </w:r>
+      <w:proofErr w:type="spellStart"/>
+      <w:r>
+        <w:t>Sequelize</w:t>
+      </w:r>
+      <w:proofErr w:type="spellEnd"/>
+      <w:r>
+        <w:t xml:space="preserve"> ORM, Authentication, RBAC, OAuth 2.0, JWT, Session Management</w:t>
+      </w:r>
+    </w:p>
+    <w:p>
+      <w:pPr>
+        <w:keepLines/>
+      </w:pPr>
+      <w:r>
+        <w:rPr>
+          <w:b/>
+        </w:rPr>
+        <w:t xml:space="preserve">Databases &amp; Cloud: </w:t>
+      </w:r>
+      <w:r>
+        <w:t xml:space="preserve">MySQL, PostgreSQL, </w:t>
+      </w:r>
+      <w:proofErr w:type="spellStart"/>
+      <w:r>
+        <w:t>Cloudinary</w:t>
+      </w:r>
+      <w:proofErr w:type="spellEnd"/>
+      <w:r>
+        <w:t xml:space="preserve">, Docker, AWS, </w:t>
+      </w:r>
+      <w:proofErr w:type="spellStart"/>
+      <w:r>
+        <w:t>Vercel</w:t>
+      </w:r>
+      <w:proofErr w:type="spellEnd"/>
+      <w:r>
+        <w:t xml:space="preserve">, GitHub Actions, CI/CD, </w:t>
+      </w:r>
+      <w:proofErr w:type="spellStart"/>
+      <w:r>
+        <w:t>cPanel</w:t>
+      </w:r>
+      <w:proofErr w:type="spellEnd"/>
+      <w:r>
+        <w:t xml:space="preserve">, </w:t>
+      </w:r>
+      <w:proofErr w:type="spellStart"/>
+      <w:r>
+        <w:t>Yegara</w:t>
+      </w:r>
+      <w:proofErr w:type="spellEnd"/>
+      <w:r>
+        <w:t xml:space="preserve"> Host</w:t>
+      </w:r>
+    </w:p>
+    <w:p>
+      <w:pPr>
+        <w:keepLines/>
+      </w:pPr>
+      <w:r>
+        <w:rPr>
+          <w:b/>
+        </w:rPr>
+        <w:t xml:space="preserve">AI &amp; Data: </w:t>
+      </w:r>
+      <w:proofErr w:type="spellStart"/>
+      <w:r>
+        <w:t>OpenAI</w:t>
+      </w:r>
+      <w:proofErr w:type="spellEnd"/>
+      <w:r>
+        <w:t xml:space="preserve"> API, Gemini AI, </w:t>
+      </w:r>
+      <w:proofErr w:type="spellStart"/>
+      <w:r>
+        <w:t>scikit</w:t>
+      </w:r>
+      <w:proofErr w:type="spellEnd"/>
+      <w:r>
+        <w:t xml:space="preserve">-learn, </w:t>
+      </w:r>
+      <w:proofErr w:type="spellStart"/>
+      <w:r>
+        <w:t>NumPy</w:t>
+      </w:r>
+      <w:proofErr w:type="spellEnd"/>
+      <w:r>
+        <w:t>, Pandas, Data Analytics, Data Visualization</w:t>
+      </w:r>
+    </w:p>
+    <w:p>
+      <w:pPr>
+        <w:keepLines/>
+      </w:pPr>
+      <w:r>
+        <w:rPr>
+          <w:b/>
+        </w:rPr>
+        <w:t xml:space="preserve">Tools &amp; Practices: </w:t>
+      </w:r>
+      <w:proofErr w:type="spellStart"/>
+      <w:r>
+        <w:t>Git</w:t>
+      </w:r>
+      <w:proofErr w:type="spellEnd"/>
+      <w:r>
+        <w:t xml:space="preserve">, </w:t>
+      </w:r>
+      <w:proofErr w:type="spellStart"/>
+      <w:r>
+        <w:t>Figma</w:t>
+      </w:r>
+      <w:proofErr w:type="spellEnd"/>
+      <w:r>
+        <w:t xml:space="preserve">, </w:t>
+      </w:r>
+      <w:r>
+        <w:t xml:space="preserve">Postman, </w:t>
+      </w:r>
+      <w:r>
+        <w:t>SEO, Core Web Vitals, API Development, Database Architecture, Software Architecture, Agile Development, OWASP Standards</w:t>
+      </w:r>
+    </w:p>
+    <w:p>
+      <w:pPr>
+        <w:pStyle w:val="Heading1"/>
+      </w:pPr>
+      <w:r>
+        <w:rPr>
+          <w:rFonts w:ascii="Arial" w:hAnsi="Arial"/>
+        </w:rPr>
+        <w:t>PROFESSIONAL EXPERIENCE</w:t>
+      </w:r>
+    </w:p>
+    <w:p>
+      <w:pPr>
+        <w:keepLines/>
+        <w:spacing w:after="20"/>
+      </w:pPr>
+      <w:r>
+        <w:rPr>
+          <w:sz w:val="10"/>
+        </w:rPr>
+        <w:t>───────────────────────────────────────────────────────────────────────────────────────────────────────────────────</w:t>
+      </w:r>
+      <w:r>
+        <w:rPr>
+          <w:sz w:val="10"/>
+        </w:rPr>
+        <w:t>───────────────────────────────</w:t>
+      </w:r>
+    </w:p>
+    <w:p>
+      <w:pPr>
+        <w:keepLines/>
+        <w:spacing w:after="20"/>
+      </w:pPr>
+      <w:r>
+        <w:rPr>
+          <w:b/>
+          <w:sz w:val="19"/>
         </w:rPr>
         <w:t>Full-Stack Engineer</w:t>
       </w:r>
       <w:r>
         <w:rPr>
-          <w:rFonts w:ascii="Times New Roman" w:hAnsi="Times New Roman" w:cs="Times New Roman"/>
+          <w:b/>
         </w:rPr>
-        <w:t xml:space="preserve"> with </w:t>
-      </w:r>
+        <w:t xml:space="preserve"> | Ethiopian Optometric Association</w:t>
+      </w:r>
+      <w:r>
+        <w:t xml:space="preserve"> | Sep 2025 – Present | Ethiopia</w:t>
+      </w:r>
+    </w:p>
+    <w:p>
+      <w:pPr>
+        <w:keepLines/>
+        <w:ind w:left="202" w:hanging="158"/>
+      </w:pPr>
       <w:r>
         <w:rPr>
-          <w:rFonts w:ascii="Times New Roman" w:hAnsi="Times New Roman" w:cs="Times New Roman"/>
           <w:b/>
-          <w:bCs/>
         </w:rPr>
-        <w:t>3+ years of experience</w:t>
-      </w:r>
+        <w:t xml:space="preserve">• </w:t>
+      </w:r>
+      <w:r>
+        <w:t>Architected and deployed the official full-stack web platform supporting digital operations, administrative management, and member services across Ethiopia.</w:t>
+      </w:r>
+    </w:p>
+    <w:p>
+      <w:pPr>
+        <w:keepLines/>
+        <w:ind w:left="202" w:hanging="158"/>
+      </w:pPr>
       <w:r>
         <w:rPr>
-          <w:rFonts w:ascii="Times New Roman" w:hAnsi="Times New Roman" w:cs="Times New Roman"/>
+          <w:b/>
         </w:rPr>
-        <w:t xml:space="preserve"> designing, developing, testing, and deploying </w:t>
-      </w:r>
+        <w:t xml:space="preserve">• </w:t>
+      </w:r>
+      <w:r>
+        <w:t>Engineered secure role-based access control (RBAC) authentication using JWT and OAuth, with automated digital credentialing, PDF generation, and QR-code verification.</w:t>
+      </w:r>
+    </w:p>
+    <w:p>
+      <w:pPr>
+        <w:keepLines/>
+        <w:ind w:left="202" w:hanging="158"/>
+      </w:pPr>
       <w:r>
         <w:rPr>
-          <w:rFonts w:ascii="Times New Roman" w:hAnsi="Times New Roman" w:cs="Times New Roman"/>
           <w:b/>
-          <w:bCs/>
         </w:rPr>
-        <w:t>web and mobile applications</w:t>
-      </w:r>
+        <w:t xml:space="preserve">• </w:t>
+      </w:r>
+      <w:r>
+        <w:t xml:space="preserve">Designed and optimized MySQL database architecture with </w:t>
+      </w:r>
+      <w:proofErr w:type="spellStart"/>
+      <w:r>
+        <w:t>Sequelize</w:t>
+      </w:r>
+      <w:proofErr w:type="spellEnd"/>
+      <w:r>
+        <w:t xml:space="preserve"> ORM and integrated </w:t>
+      </w:r>
+      <w:proofErr w:type="spellStart"/>
+      <w:r>
+        <w:t>Cloudinary</w:t>
+      </w:r>
+      <w:proofErr w:type="spellEnd"/>
+      <w:r>
+        <w:t xml:space="preserve"> for asset storage and automated cloud backups.</w:t>
+      </w:r>
+    </w:p>
+    <w:p>
+      <w:pPr>
+        <w:keepLines/>
+        <w:ind w:left="202" w:hanging="158"/>
+      </w:pPr>
       <w:r>
         <w:rPr>
-          <w:rFonts w:ascii="Times New Roman" w:hAnsi="Times New Roman" w:cs="Times New Roman"/>
+          <w:b/>
         </w:rPr>
+        <w:t xml:space="preserve">• </w:t>
+      </w:r>
+      <w:r>
+        <w:t>Developed production web features spanning frontend interfaces, backend services, database workflows, authentication, and document generation.</w:t>
+      </w:r>
+    </w:p>
+    <w:p>
+      <w:pPr>
+        <w:keepLines/>
+        <w:spacing w:after="20"/>
+      </w:pPr>
+      <w:r>
+        <w:rPr>
+          <w:b/>
+          <w:sz w:val="19"/>
+        </w:rPr>
+        <w:t>Project Team Lead, Web Developer &amp; UI/UX Designer</w:t>
+      </w:r>
+      <w:r>
+        <w:rPr>
+          <w:b/>
+        </w:rPr>
+        <w:t xml:space="preserve"> | </w:t>
+      </w:r>
+      <w:proofErr w:type="spellStart"/>
+      <w:r>
+        <w:rPr>
+          <w:b/>
+        </w:rPr>
+        <w:t>BiTech</w:t>
+      </w:r>
+      <w:proofErr w:type="spellEnd"/>
+      <w:r>
+        <w:rPr>
+          <w:b/>
+        </w:rPr>
+        <w:t xml:space="preserve"> Incubation Center</w:t>
+      </w:r>
+      <w:r>
+        <w:t xml:space="preserve"> | May 2025 – Jul 2026 | Bahir Dar, Ethiopia</w:t>
+      </w:r>
+    </w:p>
+    <w:p>
+      <w:pPr>
+        <w:keepLines/>
+        <w:ind w:left="202" w:hanging="158"/>
+      </w:pPr>
+      <w:r>
+        <w:rPr>
+          <w:b/>
+        </w:rPr>
+        <w:t xml:space="preserve">• </w:t>
+      </w:r>
+      <w:r>
+        <w:t>Led a multidisciplinary engineering and design team delivering software products for incubated technology startups.</w:t>
+      </w:r>
+    </w:p>
+    <w:p>
+      <w:pPr>
+        <w:keepLines/>
+        <w:ind w:left="202" w:hanging="158"/>
+      </w:pPr>
+      <w:r>
+        <w:rPr>
+          <w:b/>
+        </w:rPr>
+        <w:t xml:space="preserve">• </w:t>
+      </w:r>
+      <w:r>
+        <w:t xml:space="preserve">Directed UI/UX prototyping in </w:t>
+      </w:r>
+      <w:proofErr w:type="spellStart"/>
+      <w:r>
+        <w:t>Figma</w:t>
+      </w:r>
+      <w:proofErr w:type="spellEnd"/>
+      <w:r>
+        <w:t xml:space="preserve"> and full-stack web development across multiple concurrent projects.</w:t>
+      </w:r>
+    </w:p>
+    <w:p>
+      <w:pPr>
+        <w:keepLines/>
+        <w:ind w:left="202" w:hanging="158"/>
+      </w:pPr>
+      <w:r>
+        <w:rPr>
+          <w:b/>
+        </w:rPr>
+        <w:t xml:space="preserve">• </w:t>
+      </w:r>
+      <w:r>
+        <w:t>Facilitated stakeholder planning, sprint retrospectives, and technical architecture reviews to coordinate product and engineering delivery.</w:t>
+      </w:r>
+    </w:p>
+    <w:p>
+      <w:pPr>
+        <w:keepLines/>
+        <w:spacing w:after="20"/>
+      </w:pPr>
+      <w:r>
+        <w:rPr>
+          <w:b/>
+          <w:sz w:val="19"/>
+        </w:rPr>
+        <w:t>Frontend &amp; SEO Developer / Full-Stack Intern</w:t>
+      </w:r>
+      <w:r>
+        <w:rPr>
+          <w:b/>
+        </w:rPr>
+        <w:t xml:space="preserve"> | </w:t>
+      </w:r>
+      <w:proofErr w:type="spellStart"/>
+      <w:r>
+        <w:rPr>
+          <w:b/>
+        </w:rPr>
+        <w:t>Askuala</w:t>
+      </w:r>
+      <w:proofErr w:type="spellEnd"/>
+      <w:r>
+        <w:rPr>
+          <w:b/>
+        </w:rPr>
+        <w:t xml:space="preserve"> Link</w:t>
+      </w:r>
+      <w:r>
+        <w:t xml:space="preserve"> | Jul 2025 – Mar 2026 | Ethiopia</w:t>
+      </w:r>
+    </w:p>
+    <w:p>
+      <w:pPr>
+        <w:keepLines/>
+        <w:ind w:left="202" w:hanging="158"/>
+      </w:pPr>
+      <w:r>
+        <w:rPr>
+          <w:b/>
+        </w:rPr>
+        <w:t xml:space="preserve">• </w:t>
+      </w:r>
+      <w:r>
+        <w:t xml:space="preserve">Engineered responsive frontend interfaces and implemented SEO practices including metadata, indexing, </w:t>
+      </w:r>
+      <w:proofErr w:type="spellStart"/>
+      <w:r>
+        <w:t>OpenGraph</w:t>
+      </w:r>
+      <w:proofErr w:type="spellEnd"/>
+      <w:r>
+        <w:t>, and Core Web Vitals optimization for the public portal.</w:t>
+      </w:r>
+    </w:p>
+    <w:p>
+      <w:pPr>
+        <w:keepLines/>
+        <w:ind w:left="202" w:hanging="158"/>
+      </w:pPr>
+      <w:r>
+        <w:rPr>
+          <w:b/>
+        </w:rPr>
+        <w:t xml:space="preserve">• </w:t>
+      </w:r>
+      <w:r>
+        <w:t xml:space="preserve">Architected </w:t>
+      </w:r>
+      <w:proofErr w:type="spellStart"/>
+      <w:r>
+        <w:t>Askuala</w:t>
+      </w:r>
+      <w:proofErr w:type="spellEnd"/>
+      <w:r>
+        <w:t xml:space="preserve"> Wiki, an internal knowledge platform using React 19, Tailwind CSS v4, </w:t>
+      </w:r>
+      <w:proofErr w:type="spellStart"/>
+      <w:r>
+        <w:t>Zustand</w:t>
+      </w:r>
+      <w:proofErr w:type="spellEnd"/>
+      <w:r>
+        <w:t xml:space="preserve">, Node.js, Express, MySQL, </w:t>
+      </w:r>
+      <w:proofErr w:type="spellStart"/>
+      <w:r>
+        <w:t>Sequelize</w:t>
+      </w:r>
+      <w:proofErr w:type="spellEnd"/>
+      <w:r>
+        <w:t xml:space="preserve">, and </w:t>
+      </w:r>
+      <w:proofErr w:type="spellStart"/>
+      <w:r>
+        <w:t>Cloudinary</w:t>
+      </w:r>
+      <w:proofErr w:type="spellEnd"/>
+      <w:r>
+        <w:t>.</w:t>
+      </w:r>
+    </w:p>
+    <w:p>
+      <w:pPr>
+        <w:keepLines/>
+        <w:ind w:left="202" w:hanging="158"/>
+      </w:pPr>
+      <w:r>
+        <w:rPr>
+          <w:b/>
+        </w:rPr>
+        <w:t xml:space="preserve">• </w:t>
+      </w:r>
+      <w:r>
+        <w:t>Received a special commendation from the Founder &amp; CEO for technical contributions and innovation.</w:t>
+      </w:r>
+    </w:p>
+    <w:p>
+      <w:pPr>
+        <w:keepLines/>
+        <w:spacing w:after="20"/>
+      </w:pPr>
+      <w:r>
+        <w:rPr>
+          <w:b/>
+          <w:sz w:val="19"/>
+        </w:rPr>
+        <w:t>Backend Developer Intern</w:t>
+      </w:r>
+      <w:r>
+        <w:rPr>
+          <w:b/>
+        </w:rPr>
+        <w:t xml:space="preserve"> | </w:t>
+      </w:r>
+      <w:proofErr w:type="spellStart"/>
+      <w:r>
+        <w:rPr>
+          <w:b/>
+        </w:rPr>
+        <w:t>Alyah</w:t>
+      </w:r>
+      <w:proofErr w:type="spellEnd"/>
+      <w:r>
+        <w:rPr>
+          <w:b/>
+        </w:rPr>
+        <w:t xml:space="preserve"> Software</w:t>
+      </w:r>
+      <w:r>
+        <w:t xml:space="preserve"> | Jun 2025 – Aug 2025 | Ethiopia</w:t>
+      </w:r>
+    </w:p>
+    <w:p>
+      <w:pPr>
+        <w:keepLines/>
+        <w:ind w:left="202" w:hanging="158"/>
+      </w:pPr>
+      <w:r>
+        <w:rPr>
+          <w:b/>
+        </w:rPr>
+        <w:t xml:space="preserve">• </w:t>
+      </w:r>
+      <w:r>
+        <w:t xml:space="preserve">Built backend services and RESTful API infrastructure for </w:t>
+      </w:r>
+      <w:proofErr w:type="spellStart"/>
+      <w:r>
+        <w:t>Hintern</w:t>
+      </w:r>
+      <w:proofErr w:type="spellEnd"/>
+      <w:r>
+        <w:t xml:space="preserve"> Bridge, an internship-matching platform connecting university students with technology companies.</w:t>
+      </w:r>
+    </w:p>
+    <w:p>
+      <w:pPr>
+        <w:keepLines/>
+        <w:ind w:left="202" w:hanging="158"/>
+      </w:pPr>
+      <w:r>
+        <w:rPr>
+          <w:b/>
+        </w:rPr>
+        <w:t xml:space="preserve">• </w:t>
+      </w:r>
+      <w:r>
+        <w:t>Developed scalable APIs, database models, and candidate-matching logic for student applications and recruiter workflows.</w:t>
+      </w:r>
+    </w:p>
+    <w:p>
+      <w:pPr>
+        <w:keepLines/>
+        <w:spacing w:after="20"/>
+      </w:pPr>
+      <w:r>
+        <w:rPr>
+          <w:b/>
+          <w:sz w:val="19"/>
+        </w:rPr>
+        <w:t>Co-Founder &amp; CTO</w:t>
+      </w:r>
+      <w:r>
+        <w:rPr>
+          <w:b/>
+        </w:rPr>
+        <w:t xml:space="preserve"> | Code </w:t>
+      </w:r>
+      <w:proofErr w:type="spellStart"/>
+      <w:r>
+        <w:rPr>
+          <w:b/>
+        </w:rPr>
+        <w:t>Biruh</w:t>
+      </w:r>
+      <w:proofErr w:type="spellEnd"/>
+      <w:r>
+        <w:t xml:space="preserve"> | 2024 – 2025 | Ethiopia</w:t>
+      </w:r>
+    </w:p>
+    <w:p>
+      <w:pPr>
+        <w:keepLines/>
+        <w:ind w:left="202" w:hanging="158"/>
+      </w:pPr>
+      <w:r>
+        <w:rPr>
+          <w:b/>
+        </w:rPr>
+        <w:t xml:space="preserve">• </w:t>
+      </w:r>
+      <w:r>
+        <w:t>Directed technical strategy, client web development projects, and curriculum design for developer training programs.</w:t>
+      </w:r>
+    </w:p>
+    <w:p>
+      <w:pPr>
+        <w:keepLines/>
+        <w:ind w:left="202" w:hanging="158"/>
+      </w:pPr>
+      <w:r>
+        <w:rPr>
+          <w:b/>
+        </w:rPr>
+        <w:t xml:space="preserve">• </w:t>
+      </w:r>
+      <w:r>
+        <w:t>Trained aspiring developers in programming fundamentals while delivering custom web solutions for local businesses and organizations.</w:t>
+      </w:r>
+    </w:p>
+    <w:p>
+      <w:pPr>
+        <w:keepLines/>
+        <w:spacing w:after="20"/>
+      </w:pPr>
+      <w:r>
+        <w:rPr>
+          <w:b/>
+          <w:sz w:val="19"/>
+        </w:rPr>
+        <w:t>Web Development Intern</w:t>
+      </w:r>
+      <w:r>
+        <w:rPr>
+          <w:b/>
+        </w:rPr>
+        <w:t xml:space="preserve"> | Oasis </w:t>
+      </w:r>
+      <w:proofErr w:type="spellStart"/>
+      <w:r>
+        <w:rPr>
+          <w:b/>
+        </w:rPr>
+        <w:t>Infobyte</w:t>
+      </w:r>
+      <w:proofErr w:type="spellEnd"/>
+      <w:r>
+        <w:t xml:space="preserve"> | Feb 2025 – Mar 2025 | Remote, India</w:t>
+      </w:r>
+    </w:p>
+    <w:p>
+      <w:pPr>
+        <w:keepLines/>
+        <w:ind w:left="202" w:hanging="158"/>
+      </w:pPr>
+      <w:r>
+        <w:rPr>
+          <w:b/>
+        </w:rPr>
+        <w:t xml:space="preserve">• </w:t>
+      </w:r>
+      <w:r>
+        <w:t>Developed web applications addressing client requirements in an agile, remote development environment.</w:t>
+      </w:r>
+    </w:p>
+    <w:p>
+      <w:pPr>
+        <w:keepLines/>
+        <w:spacing w:after="20"/>
+      </w:pPr>
+      <w:r>
+        <w:rPr>
+          <w:b/>
+          <w:sz w:val="19"/>
+        </w:rPr>
+        <w:t>Web Development Intern</w:t>
+      </w:r>
+      <w:r>
+        <w:rPr>
+          <w:b/>
+        </w:rPr>
+        <w:t xml:space="preserve"> | XAI</w:t>
+      </w:r>
+      <w:r>
+        <w:t xml:space="preserve"> | Dec 2024 – Jan 2025 | Remote, Morocco</w:t>
+      </w:r>
+    </w:p>
+    <w:p>
+      <w:pPr>
+        <w:keepLines/>
+        <w:ind w:left="202" w:hanging="158"/>
+        <w:sectPr>
+          <w:pgSz w:w="12240" w:h="15840"/>
+          <w:pgMar w:top="648" w:right="936" w:bottom="648" w:left="936" w:header="720" w:footer="720" w:gutter="0"/>
+          <w:cols w:space="720"/>
+          <w:docGrid w:linePitch="360"/>
+        </w:sectPr>
+      </w:pPr>
+      <w:r>
+        <w:rPr>
+          <w:b/>
+        </w:rPr>
+        <w:t xml:space="preserve">• </w:t>
+      </w:r>
+      <w:r>
+        <w:t>Contributed to frontend and backend web features for international clients with a focus on performance and production-quality delivery.</w:t>
+      </w:r>
+    </w:p>
+    <w:p>
+      <w:pPr>
+        <w:keepLines/>
+        <w:ind w:left="202" w:hanging="158"/>
+      </w:pPr>
+    </w:p>
+    <w:p>
+      <w:pPr>
+        <w:pStyle w:val="Heading1"/>
+      </w:pPr>
+      <w:r>
+        <w:rPr>
+          <w:rFonts w:ascii="Arial" w:hAnsi="Arial"/>
+        </w:rPr>
+        <w:t>SELECTED PROJECTS</w:t>
+      </w:r>
+    </w:p>
+    <w:p>
+      <w:pPr>
+        <w:keepLines/>
+        <w:spacing w:after="20"/>
+      </w:pPr>
+      <w:r>
+        <w:rPr>
+          <w:sz w:val="10"/>
+        </w:rPr>
+        <w:t>───────────────────────────────────────────────────────────────────────────────────────────────────────────────────</w:t>
+      </w:r>
+      <w:r>
+        <w:rPr>
+          <w:sz w:val="10"/>
+        </w:rPr>
+        <w:t>───────────────────────────────</w:t>
+      </w:r>
+    </w:p>
+    <w:p>
+      <w:pPr>
+        <w:keepLines/>
+        <w:spacing w:after="20"/>
+      </w:pPr>
+      <w:r>
+        <w:rPr>
+          <w:b/>
+          <w:sz w:val="19"/>
+        </w:rPr>
+        <w:t>Ethiopian Optometric Association Platform</w:t>
+      </w:r>
+      <w:r>
+        <w:rPr>
+          <w:b/>
+        </w:rPr>
+        <w:t xml:space="preserve"> </w:t>
+      </w:r>
+      <w:r>
+        <w:rPr>
+          <w:b/>
+        </w:rPr>
+        <w:t xml:space="preserve">| </w:t>
+      </w:r>
+    </w:p>
+    <w:p>
+      <w:pPr>
+        <w:keepLines/>
+        <w:ind w:left="202" w:hanging="158"/>
+      </w:pPr>
+      <w:r>
+        <w:rPr>
+          <w:b/>
+        </w:rPr>
+        <w:t xml:space="preserve">• </w:t>
+      </w:r>
+      <w:r>
+        <w:t>Enterprise full-stack operational system with role-based dashboards, membership management, payment audit workflows, automated PDF issuance, and QR-based identity authentication.</w:t>
+      </w:r>
+    </w:p>
+    <w:p>
+      <w:pPr>
+        <w:keepLines/>
+        <w:ind w:left="202" w:hanging="158"/>
+      </w:pPr>
+      <w:r>
+        <w:rPr>
+          <w:b/>
+        </w:rPr>
+        <w:t xml:space="preserve">• </w:t>
+      </w:r>
+      <w:r>
+        <w:t xml:space="preserve">Stack: React, Node.js, Express.js, MySQL, </w:t>
+      </w:r>
+      <w:proofErr w:type="spellStart"/>
+      <w:r>
+        <w:t>Sequelize</w:t>
+      </w:r>
+      <w:proofErr w:type="spellEnd"/>
+      <w:r>
+        <w:t xml:space="preserve">, JWT, </w:t>
+      </w:r>
+      <w:proofErr w:type="spellStart"/>
+      <w:r>
+        <w:t>Cloudinary</w:t>
+      </w:r>
+      <w:proofErr w:type="spellEnd"/>
+      <w:r>
         <w:t xml:space="preserve">, </w:t>
       </w:r>
+      <w:proofErr w:type="spellStart"/>
+      <w:r>
+        <w:t>PDFKit</w:t>
+      </w:r>
+      <w:proofErr w:type="spellEnd"/>
+      <w:r>
+        <w:t xml:space="preserve">, </w:t>
+      </w:r>
+      <w:proofErr w:type="spellStart"/>
+      <w:r>
+        <w:t>QRCode</w:t>
+      </w:r>
+      <w:proofErr w:type="spellEnd"/>
+      <w:r>
+        <w:t>, Tailwind CSS.</w:t>
+      </w:r>
+    </w:p>
+    <w:p>
+      <w:pPr>
+        <w:keepLines/>
+        <w:ind w:left="202" w:hanging="158"/>
+      </w:pPr>
+      <w:proofErr w:type="spellStart"/>
       <w:r>
         <w:rPr>
-          <w:rFonts w:ascii="Times New Roman" w:hAnsi="Times New Roman" w:cs="Times New Roman"/>
-          <w:b/>
-          <w:bCs/>
-        </w:rPr>
-        <w:t>RESTful APIs</w:t>
-      </w:r>
-      <w:r>
-        <w:rPr>
-          <w:rFonts w:ascii="Times New Roman" w:hAnsi="Times New Roman" w:cs="Times New Roman"/>
-        </w:rPr>
-        <w:t xml:space="preserve">, and software platforms. Experienced in </w:t>
-      </w:r>
-      <w:r>
-        <w:rPr>
-          <w:rFonts w:ascii="Times New Roman" w:hAnsi="Times New Roman" w:cs="Times New Roman"/>
-          <w:b/>
-          <w:bCs/>
-        </w:rPr>
-        <w:t>full-stack development</w:t>
-      </w:r>
-      <w:r>
-        <w:rPr>
-          <w:rFonts w:ascii="Times New Roman" w:hAnsi="Times New Roman" w:cs="Times New Roman"/>
-        </w:rPr>
-        <w:t xml:space="preserve"> using </w:t>
-      </w:r>
-      <w:r>
-        <w:rPr>
-          <w:rFonts w:ascii="Times New Roman" w:hAnsi="Times New Roman" w:cs="Times New Roman"/>
-          <w:b/>
-          <w:bCs/>
-        </w:rPr>
-        <w:t xml:space="preserve">Node.js, Express.js, </w:t>
-      </w:r>
-      <w:proofErr w:type="spellStart"/>
-      <w:r>
-        <w:rPr>
-          <w:rFonts w:ascii="Times New Roman" w:hAnsi="Times New Roman" w:cs="Times New Roman"/>
-          <w:b/>
-          <w:bCs/>
-        </w:rPr>
-        <w:t>TypeScript</w:t>
-      </w:r>
-      <w:proofErr w:type="spellEnd"/>
-      <w:r>
-        <w:rPr>
-          <w:rFonts w:ascii="Times New Roman" w:hAnsi="Times New Roman" w:cs="Times New Roman"/>
-          <w:b/>
-          <w:bCs/>
-        </w:rPr>
-        <w:t>, React, Next.js, PostgreSQL, MySQL, Tailwind CSS, React Native, and Flutter</w:t>
-      </w:r>
-      <w:r>
-        <w:rPr>
-          <w:rFonts w:ascii="Times New Roman" w:hAnsi="Times New Roman" w:cs="Times New Roman"/>
-        </w:rPr>
-        <w:t xml:space="preserve">. Experience delivering software solutions for organizations including the </w:t>
-      </w:r>
-      <w:r>
-        <w:rPr>
-          <w:rFonts w:ascii="Times New Roman" w:hAnsi="Times New Roman" w:cs="Times New Roman"/>
-          <w:b/>
-          <w:bCs/>
-        </w:rPr>
-        <w:t>Et</w:t>
-      </w:r>
-      <w:r>
-        <w:rPr>
-          <w:rFonts w:ascii="Times New Roman" w:hAnsi="Times New Roman" w:cs="Times New Roman"/>
-          <w:b/>
-          <w:bCs/>
-        </w:rPr>
-        <w:t xml:space="preserve">hiopian Optometric Association, </w:t>
-      </w:r>
-      <w:proofErr w:type="spellStart"/>
-      <w:r>
-        <w:rPr>
-          <w:rFonts w:ascii="Times New Roman" w:hAnsi="Times New Roman" w:cs="Times New Roman"/>
           <w:b/>
           <w:bCs/>
         </w:rPr>
@@ -443,1877 +1406,852 @@
       <w:proofErr w:type="spellEnd"/>
       <w:r>
         <w:rPr>
-          <w:rFonts w:ascii="Times New Roman" w:hAnsi="Times New Roman" w:cs="Times New Roman"/>
           <w:b/>
           <w:bCs/>
         </w:rPr>
-        <w:t xml:space="preserve"> Link,</w:t>
-      </w:r>
+        <w:t xml:space="preserve"> Link Official Platform |</w:t>
+      </w:r>
+      <w:r>
+        <w:t xml:space="preserve"> </w:t>
+      </w:r>
+    </w:p>
+    <w:p>
+      <w:pPr>
+        <w:keepLines/>
+        <w:ind w:left="202" w:hanging="158"/>
+      </w:pPr>
       <w:r>
         <w:rPr>
-          <w:rFonts w:ascii="Times New Roman" w:hAnsi="Times New Roman" w:cs="Times New Roman"/>
           <w:b/>
           <w:bCs/>
         </w:rPr>
-        <w:t xml:space="preserve"> </w:t>
-      </w:r>
-      <w:proofErr w:type="spellStart"/>
+        <w:t>•</w:t>
+      </w:r>
+      <w:r>
+        <w:t xml:space="preserve"> AI-powered smart s</w:t>
+      </w:r>
+      <w:r>
+        <w:t>chool system, collaborating with the development team to build and refine a high-performance, responsive experience. Implemented dynamic content experiences, modern UI improvements, SEO enhancements, and performance optimizations to deliver a polished, production-ready platform across devices.</w:t>
+      </w:r>
+    </w:p>
+    <w:p>
+      <w:pPr>
+        <w:keepLines/>
+        <w:ind w:left="202" w:hanging="158"/>
+      </w:pPr>
       <w:r>
         <w:rPr>
-          <w:rFonts w:ascii="Times New Roman" w:hAnsi="Times New Roman" w:cs="Times New Roman"/>
           <w:b/>
           <w:bCs/>
         </w:rPr>
-        <w:t>BiTech</w:t>
+        <w:t>•</w:t>
+      </w:r>
+      <w:r>
+        <w:t xml:space="preserve"> Stack: React, Next.js, Tailwind CSS, JavaScript, SEO (Meta/</w:t>
+      </w:r>
+      <w:proofErr w:type="spellStart"/>
+      <w:r>
+        <w:t>OpenGraph</w:t>
       </w:r>
       <w:proofErr w:type="spellEnd"/>
       <w:r>
+        <w:t>), Core Web Vitals, REST APIs.</w:t>
+      </w:r>
+    </w:p>
+    <w:p>
+      <w:pPr>
+        <w:keepLines/>
+        <w:spacing w:after="20"/>
+      </w:pPr>
+      <w:proofErr w:type="spellStart"/>
+      <w:r>
         <w:rPr>
-          <w:rFonts w:ascii="Times New Roman" w:hAnsi="Times New Roman" w:cs="Times New Roman"/>
           <w:b/>
+          <w:sz w:val="19"/>
+        </w:rPr>
+        <w:t>AlphaX</w:t>
+      </w:r>
+      <w:proofErr w:type="spellEnd"/>
+      <w:r>
+        <w:rPr>
+          <w:b/>
+          <w:sz w:val="19"/>
+        </w:rPr>
+        <w:t xml:space="preserve"> </w:t>
+      </w:r>
+      <w:proofErr w:type="spellStart"/>
+      <w:r>
+        <w:rPr>
+          <w:b/>
+          <w:sz w:val="19"/>
+        </w:rPr>
+        <w:t>EdTech</w:t>
+      </w:r>
+      <w:proofErr w:type="spellEnd"/>
+      <w:r>
+        <w:rPr>
+          <w:b/>
+          <w:sz w:val="19"/>
+        </w:rPr>
+        <w:t xml:space="preserve"> &amp; Interactive Coding Platform</w:t>
+      </w:r>
+      <w:r>
+        <w:rPr>
+          <w:b/>
+        </w:rPr>
+        <w:t xml:space="preserve"> | </w:t>
+      </w:r>
+      <w:r>
+        <w:t xml:space="preserve"> </w:t>
+      </w:r>
+    </w:p>
+    <w:p>
+      <w:pPr>
+        <w:keepLines/>
+        <w:ind w:left="202" w:hanging="158"/>
+      </w:pPr>
+      <w:r>
+        <w:rPr>
+          <w:b/>
+        </w:rPr>
+        <w:t xml:space="preserve">• </w:t>
+      </w:r>
+      <w:r>
+        <w:t xml:space="preserve">Bilingual Amharic/English learning platform for C++ and web fundamentals with interactive lessons, placement tests, browser-based g++ compiler, AI tutor, </w:t>
+      </w:r>
+      <w:proofErr w:type="spellStart"/>
+      <w:r>
+        <w:t>WebSockets</w:t>
+      </w:r>
+      <w:proofErr w:type="spellEnd"/>
+      <w:r>
+        <w:t>, and Chapa payment integration.</w:t>
+      </w:r>
+    </w:p>
+    <w:p>
+      <w:pPr>
+        <w:keepLines/>
+        <w:ind w:left="202" w:hanging="158"/>
+      </w:pPr>
+      <w:r>
+        <w:rPr>
+          <w:b/>
+        </w:rPr>
+        <w:t xml:space="preserve">• </w:t>
+      </w:r>
+      <w:r>
+        <w:t xml:space="preserve">Stack: Next.js, React, </w:t>
+      </w:r>
+      <w:proofErr w:type="spellStart"/>
+      <w:r>
+        <w:t>TypeScript</w:t>
+      </w:r>
+      <w:proofErr w:type="spellEnd"/>
+      <w:r>
+        <w:t xml:space="preserve">, Node.js, Express.js, MySQL, </w:t>
+      </w:r>
+      <w:proofErr w:type="spellStart"/>
+      <w:r>
+        <w:t>WebSockets</w:t>
+      </w:r>
+      <w:proofErr w:type="spellEnd"/>
+      <w:r>
+        <w:t xml:space="preserve">, Gemini AI, </w:t>
+      </w:r>
+      <w:proofErr w:type="spellStart"/>
+      <w:r>
+        <w:t>OpenAI</w:t>
+      </w:r>
+      <w:proofErr w:type="spellEnd"/>
+      <w:r>
+        <w:t>, g++ compiler, Chapa Pay.</w:t>
+      </w:r>
+    </w:p>
+    <w:p>
+      <w:pPr>
+        <w:keepLines/>
+        <w:spacing w:after="20"/>
+      </w:pPr>
+      <w:proofErr w:type="spellStart"/>
+      <w:r>
+        <w:rPr>
+          <w:b/>
+          <w:sz w:val="19"/>
+        </w:rPr>
+        <w:t>Tenashi</w:t>
+      </w:r>
+      <w:proofErr w:type="spellEnd"/>
+      <w:r>
+        <w:rPr>
+          <w:b/>
+          <w:sz w:val="19"/>
+        </w:rPr>
+        <w:t xml:space="preserve"> AI Health Monitor</w:t>
+      </w:r>
+      <w:r>
+        <w:rPr>
+          <w:b/>
+        </w:rPr>
+        <w:t xml:space="preserve"> | </w:t>
+      </w:r>
+      <w:r>
+        <w:t xml:space="preserve"> </w:t>
+      </w:r>
+      <w:r>
+        <w:t xml:space="preserve"> </w:t>
+      </w:r>
+    </w:p>
+    <w:p>
+      <w:pPr>
+        <w:keepLines/>
+        <w:ind w:left="202" w:hanging="158"/>
+      </w:pPr>
+      <w:r>
+        <w:rPr>
+          <w:b/>
+        </w:rPr>
+        <w:t xml:space="preserve">• </w:t>
+      </w:r>
+      <w:r>
+        <w:t xml:space="preserve">AI-driven monitoring application using </w:t>
+      </w:r>
+      <w:proofErr w:type="spellStart"/>
+      <w:r>
+        <w:t>IsolationForest</w:t>
+      </w:r>
+      <w:proofErr w:type="spellEnd"/>
+      <w:r>
+        <w:t xml:space="preserve"> anomaly detection, real-time metrics processing, data visualization, and containerized services.</w:t>
+      </w:r>
+    </w:p>
+    <w:p>
+      <w:pPr>
+        <w:keepLines/>
+        <w:ind w:left="202" w:hanging="158"/>
+      </w:pPr>
+      <w:r>
+        <w:rPr>
+          <w:b/>
+        </w:rPr>
+        <w:t xml:space="preserve">• </w:t>
+      </w:r>
+      <w:r>
+        <w:t xml:space="preserve">Stack: React, </w:t>
+      </w:r>
+      <w:proofErr w:type="spellStart"/>
+      <w:r>
+        <w:t>Vite</w:t>
+      </w:r>
+      <w:proofErr w:type="spellEnd"/>
+      <w:r>
+        <w:t xml:space="preserve">, Chart.js, Python, Flask, </w:t>
+      </w:r>
+      <w:proofErr w:type="spellStart"/>
+      <w:r>
+        <w:t>scikit</w:t>
+      </w:r>
+      <w:proofErr w:type="spellEnd"/>
+      <w:r>
+        <w:t xml:space="preserve">-learn, </w:t>
+      </w:r>
+      <w:proofErr w:type="spellStart"/>
+      <w:r>
+        <w:t>NumPy</w:t>
+      </w:r>
+      <w:proofErr w:type="spellEnd"/>
+      <w:r>
+        <w:t>, Pandas, Docker.</w:t>
+      </w:r>
+    </w:p>
+    <w:p>
+      <w:pPr>
+        <w:keepLines/>
+        <w:spacing w:after="20"/>
+      </w:pPr>
+      <w:proofErr w:type="spellStart"/>
+      <w:r>
+        <w:rPr>
+          <w:b/>
+          <w:sz w:val="19"/>
+        </w:rPr>
+        <w:t>Askuala</w:t>
+      </w:r>
+      <w:proofErr w:type="spellEnd"/>
+      <w:r>
+        <w:rPr>
+          <w:b/>
+          <w:sz w:val="19"/>
+        </w:rPr>
+        <w:t xml:space="preserve"> Wiki</w:t>
+      </w:r>
+      <w:r>
+        <w:rPr>
+          <w:b/>
+        </w:rPr>
+        <w:t xml:space="preserve"> | </w:t>
+      </w:r>
+      <w:r>
+        <w:t xml:space="preserve"> </w:t>
+      </w:r>
+      <w:r>
+        <w:t xml:space="preserve"> </w:t>
+      </w:r>
+    </w:p>
+    <w:p>
+      <w:pPr>
+        <w:keepLines/>
+        <w:ind w:left="202" w:hanging="158"/>
+      </w:pPr>
+      <w:r>
+        <w:rPr>
+          <w:b/>
+        </w:rPr>
+        <w:t xml:space="preserve">• </w:t>
+      </w:r>
+      <w:r>
+        <w:t xml:space="preserve">High-performance internal knowledge platform built with React 19, </w:t>
+      </w:r>
+      <w:proofErr w:type="spellStart"/>
+      <w:r>
+        <w:t>Zustand</w:t>
+      </w:r>
+      <w:proofErr w:type="spellEnd"/>
+      <w:r>
+        <w:t xml:space="preserve">, Node.js REST APIs, MySQL, </w:t>
+      </w:r>
+      <w:proofErr w:type="spellStart"/>
+      <w:r>
+        <w:t>Sequelize</w:t>
+      </w:r>
+      <w:proofErr w:type="spellEnd"/>
+      <w:r>
+        <w:t xml:space="preserve">, </w:t>
+      </w:r>
+      <w:proofErr w:type="spellStart"/>
+      <w:r>
+        <w:t>Cloudinary</w:t>
+      </w:r>
+      <w:proofErr w:type="spellEnd"/>
+      <w:r>
+        <w:t>, and Tailwind CSS v4.</w:t>
+      </w:r>
+    </w:p>
+    <w:p>
+      <w:pPr>
+        <w:pStyle w:val="Heading1"/>
+      </w:pPr>
+      <w:r>
+        <w:rPr>
+          <w:rFonts w:ascii="Arial" w:hAnsi="Arial"/>
+        </w:rPr>
+        <w:t>EDUCATION</w:t>
+      </w:r>
+    </w:p>
+    <w:p>
+      <w:pPr>
+        <w:keepLines/>
+        <w:spacing w:after="20"/>
+      </w:pPr>
+      <w:r>
+        <w:rPr>
+          <w:sz w:val="10"/>
+        </w:rPr>
+        <w:t>───────────────────────────────────────────────────────────────────────────────────────────────────────────────────</w:t>
+      </w:r>
+      <w:r>
+        <w:rPr>
+          <w:sz w:val="10"/>
+        </w:rPr>
+        <w:t>───────────────────────────────</w:t>
+      </w:r>
+    </w:p>
+    <w:p>
+      <w:pPr>
+        <w:keepLines/>
+        <w:spacing w:after="20"/>
+      </w:pPr>
+      <w:r>
+        <w:rPr>
+          <w:b/>
+          <w:sz w:val="19"/>
+        </w:rPr>
+        <w:t>Bachelor of Science in Information Systems</w:t>
+      </w:r>
+      <w:r>
+        <w:rPr>
+          <w:b/>
+        </w:rPr>
+        <w:t xml:space="preserve"> | Bahir Dar Institute of Technology (</w:t>
+      </w:r>
+      <w:proofErr w:type="spellStart"/>
+      <w:r>
+        <w:rPr>
+          <w:b/>
+        </w:rPr>
+        <w:t>BiT</w:t>
+      </w:r>
+      <w:proofErr w:type="spellEnd"/>
+      <w:r>
+        <w:rPr>
+          <w:b/>
+        </w:rPr>
+        <w:t>), Bahir Dar University</w:t>
+      </w:r>
+      <w:r>
+        <w:t xml:space="preserve"> | </w:t>
+      </w:r>
+      <w:r>
+        <w:t>2022 - 2026</w:t>
+      </w:r>
+    </w:p>
+    <w:p>
+      <w:pPr>
+        <w:keepLines/>
+        <w:ind w:left="202" w:hanging="158"/>
+      </w:pPr>
+      <w:r>
+        <w:rPr>
+          <w:b/>
+        </w:rPr>
+        <w:t xml:space="preserve">• </w:t>
+      </w:r>
+      <w:r>
+        <w:t>Relevant coursework: Data Structures &amp; Algorithms, Object-Oriented Programming, C++, Java, C#, Python, JavaScript, Machine Learning, Mobile App Development, Operating Systems.</w:t>
+      </w:r>
+    </w:p>
+    <w:p>
+      <w:pPr>
+        <w:keepLines/>
+        <w:ind w:left="202" w:hanging="158"/>
+      </w:pPr>
+      <w:r>
+        <w:rPr>
+          <w:b/>
+        </w:rPr>
+        <w:t xml:space="preserve">• </w:t>
+      </w:r>
+      <w:r>
+        <w:t xml:space="preserve">Recognition: Top 3 Internship Project of 2025; 3rd Place, </w:t>
+      </w:r>
+      <w:proofErr w:type="spellStart"/>
+      <w:r>
+        <w:t>BiT</w:t>
+      </w:r>
+      <w:proofErr w:type="spellEnd"/>
+      <w:r>
+        <w:t xml:space="preserve"> AI Hackathon.</w:t>
+      </w:r>
+    </w:p>
+    <w:p>
+      <w:pPr>
+        <w:pStyle w:val="Heading1"/>
+      </w:pPr>
+      <w:r>
+        <w:rPr>
+          <w:rFonts w:ascii="Arial" w:hAnsi="Arial"/>
+        </w:rPr>
+        <w:t>CERTIFICATIONS &amp; RECOGNITION</w:t>
+      </w:r>
+    </w:p>
+    <w:p>
+      <w:pPr>
+        <w:keepLines/>
+        <w:spacing w:after="20"/>
+      </w:pPr>
+      <w:r>
+        <w:rPr>
+          <w:sz w:val="10"/>
+        </w:rPr>
+        <w:t>───────────────────────────────────────────────────────────────────────────────────────────────────────────────────</w:t>
+      </w:r>
+      <w:r>
+        <w:rPr>
+          <w:sz w:val="10"/>
+        </w:rPr>
+        <w:t>───────────────────────────────</w:t>
+      </w:r>
+    </w:p>
+    <w:p>
+      <w:pPr>
+        <w:keepLines/>
+        <w:ind w:left="202" w:hanging="158"/>
+      </w:pPr>
+      <w:r>
+        <w:rPr>
+          <w:b/>
+        </w:rPr>
+        <w:t xml:space="preserve">• </w:t>
+      </w:r>
+      <w:r>
+        <w:t>PLP Software Development Scholarship — Power Learn Project</w:t>
+      </w:r>
+    </w:p>
+    <w:p>
+      <w:pPr>
+        <w:keepLines/>
+        <w:ind w:left="202" w:hanging="158"/>
+      </w:pPr>
+      <w:r>
+        <w:rPr>
+          <w:b/>
+        </w:rPr>
+        <w:t xml:space="preserve">• </w:t>
+      </w:r>
+      <w:r>
+        <w:t xml:space="preserve">Backend </w:t>
+      </w:r>
+      <w:proofErr w:type="spellStart"/>
+      <w:r>
+        <w:t>Bootcamp</w:t>
+      </w:r>
+      <w:proofErr w:type="spellEnd"/>
+      <w:r>
+        <w:t xml:space="preserve"> Engineer Certification — IS HUB, Addis Ababa University</w:t>
+      </w:r>
+    </w:p>
+    <w:p>
+      <w:pPr>
+        <w:keepLines/>
+        <w:ind w:left="202" w:hanging="158"/>
+      </w:pPr>
+      <w:r>
+        <w:rPr>
+          <w:b/>
+        </w:rPr>
+        <w:t xml:space="preserve">• </w:t>
+      </w:r>
+      <w:r>
+        <w:t xml:space="preserve">Fundamentals of Web Development Certification — </w:t>
+      </w:r>
+      <w:proofErr w:type="spellStart"/>
+      <w:r>
+        <w:t>Udacity</w:t>
+      </w:r>
+      <w:proofErr w:type="spellEnd"/>
+    </w:p>
+    <w:p>
+      <w:pPr>
+        <w:keepLines/>
+        <w:ind w:left="202" w:hanging="158"/>
+      </w:pPr>
+      <w:r>
+        <w:rPr>
+          <w:b/>
+        </w:rPr>
+        <w:t xml:space="preserve">• </w:t>
+      </w:r>
+      <w:r>
+        <w:t>English Language &amp; Professional Communication Trainee — ELIC</w:t>
+      </w:r>
+      <w:r>
+        <w:t xml:space="preserve">, </w:t>
+      </w:r>
+      <w:proofErr w:type="spellStart"/>
+      <w:r>
+        <w:t>BiT</w:t>
+      </w:r>
+      <w:proofErr w:type="spellEnd"/>
+    </w:p>
+    <w:p>
+      <w:pPr>
+        <w:keepLines/>
+        <w:ind w:left="202" w:hanging="158"/>
+      </w:pPr>
+      <w:r>
+        <w:rPr>
+          <w:b/>
+        </w:rPr>
+        <w:t xml:space="preserve">• </w:t>
+      </w:r>
+      <w:r>
+        <w:t>Top 10 Finalist — Innovation for Peace 2025</w:t>
+      </w:r>
+    </w:p>
+    <w:p>
+      <w:pPr>
+        <w:keepLines/>
+        <w:ind w:left="202" w:hanging="158"/>
+      </w:pPr>
+      <w:r>
+        <w:rPr>
+          <w:b/>
+        </w:rPr>
+        <w:t xml:space="preserve">• </w:t>
+      </w:r>
+      <w:r>
+        <w:t xml:space="preserve">3rd Place Winner — </w:t>
+      </w:r>
+      <w:proofErr w:type="spellStart"/>
+      <w:r>
+        <w:t>BiT</w:t>
+      </w:r>
+      <w:proofErr w:type="spellEnd"/>
+      <w:r>
+        <w:t xml:space="preserve"> AI Hackathon</w:t>
+      </w:r>
+    </w:p>
+    <w:p>
+      <w:pPr>
+        <w:pStyle w:val="Heading1"/>
+      </w:pPr>
+      <w:r>
+        <w:rPr>
+          <w:rFonts w:ascii="Arial" w:hAnsi="Arial"/>
+        </w:rPr>
+        <w:t>LEADERSHIP &amp; COMMUNITY</w:t>
+      </w:r>
+    </w:p>
+    <w:p>
+      <w:pPr>
+        <w:keepLines/>
+        <w:spacing w:after="20"/>
+      </w:pPr>
+      <w:r>
+        <w:rPr>
+          <w:sz w:val="10"/>
+        </w:rPr>
+        <w:t>───────────────────────────────────────────────────────────────────────────────────────────────────────────────────</w:t>
+      </w:r>
+      <w:r>
+        <w:rPr>
+          <w:sz w:val="10"/>
+        </w:rPr>
+        <w:t>───────────────────────────────</w:t>
+      </w:r>
+    </w:p>
+    <w:p>
+      <w:pPr>
+        <w:keepLines/>
+        <w:ind w:left="202" w:hanging="158"/>
+      </w:pPr>
+      <w:r>
+        <w:rPr>
+          <w:b/>
+        </w:rPr>
+        <w:t xml:space="preserve">• </w:t>
+      </w:r>
+      <w:r>
+        <w:rPr>
+          <w:b/>
+        </w:rPr>
+        <w:t>Founder &amp; Community Lead</w:t>
+      </w:r>
+      <w:r>
+        <w:t xml:space="preserve">, Meta </w:t>
+      </w:r>
+      <w:proofErr w:type="spellStart"/>
+      <w:r>
+        <w:t>Codz</w:t>
+      </w:r>
+      <w:proofErr w:type="spellEnd"/>
+      <w:r>
+        <w:t xml:space="preserve"> (</w:t>
+      </w:r>
+      <w:proofErr w:type="spellStart"/>
+      <w:r>
+        <w:t>BiT</w:t>
+      </w:r>
+      <w:proofErr w:type="spellEnd"/>
+      <w:r>
+        <w:t>), Jun 2025 – Jun 2026 — Founded and led a student technology community; organized workshops, guest lectures, expert interviews, and project showcases for 100+ student developers.</w:t>
+      </w:r>
+    </w:p>
+    <w:p>
+      <w:pPr>
+        <w:keepLines/>
+        <w:ind w:left="202" w:hanging="158"/>
+      </w:pPr>
+      <w:r>
+        <w:rPr>
+          <w:b/>
+        </w:rPr>
+        <w:t xml:space="preserve">• </w:t>
+      </w:r>
+      <w:r>
+        <w:rPr>
+          <w:b/>
+        </w:rPr>
+        <w:t>Hackathon Organizer</w:t>
+      </w:r>
+      <w:r>
+        <w:t>, Cursor Hackathon, Oct – Nov 2025 — Co-organized an international-scale hackathon, coordinating logistics, mentorship, jury evaluation criteria, university leadership relations, and industry partnerships.</w:t>
+      </w:r>
+    </w:p>
+    <w:p>
+      <w:pPr>
+        <w:keepLines/>
+        <w:ind w:left="202" w:hanging="158"/>
+      </w:pPr>
+      <w:r>
+        <w:rPr>
+          <w:b/>
+        </w:rPr>
+        <w:t xml:space="preserve">• </w:t>
+      </w:r>
+      <w:r>
+        <w:rPr>
+          <w:b/>
+        </w:rPr>
+        <w:t>Web Development Mentor</w:t>
+      </w:r>
+      <w:r>
+        <w:t xml:space="preserve">, </w:t>
+      </w:r>
+      <w:proofErr w:type="spellStart"/>
+      <w:r>
+        <w:t>Eshet</w:t>
+      </w:r>
+      <w:proofErr w:type="spellEnd"/>
+      <w:r>
+        <w:t xml:space="preserve"> Academy, Mar – May 2025 — Mentored high school students through a 3-month coding </w:t>
+      </w:r>
+      <w:proofErr w:type="spellStart"/>
+      <w:r>
+        <w:t>bootcamp</w:t>
+      </w:r>
+      <w:proofErr w:type="spellEnd"/>
+      <w:r>
+        <w:t xml:space="preserve"> and guided teams building real-world applications.</w:t>
+      </w:r>
+    </w:p>
+    <w:p>
+      <w:pPr>
+        <w:pStyle w:val="Heading1"/>
+      </w:pPr>
+      <w:r>
+        <w:rPr>
+          <w:rFonts w:ascii="Arial" w:hAnsi="Arial"/>
+        </w:rPr>
+        <w:t>Language</w:t>
+      </w:r>
+    </w:p>
+    <w:p>
+      <w:pPr>
+        <w:keepLines/>
+        <w:spacing w:after="20"/>
+      </w:pPr>
+      <w:r>
+        <w:rPr>
+          <w:sz w:val="10"/>
+        </w:rPr>
+        <w:t>──────────────────────────────────────────────────────────────────────────────────────────────────────────────────────────────────────────────────</w:t>
+      </w:r>
+    </w:p>
+    <w:p>
+      <w:pPr>
+        <w:keepLines/>
+        <w:ind w:left="202" w:hanging="158"/>
+      </w:pPr>
+      <w:r>
+        <w:rPr>
           <w:bCs/>
         </w:rPr>
-        <w:t>,</w:t>
-      </w:r>
+        <w:t>•</w:t>
+      </w:r>
+      <w:r>
+        <w:t xml:space="preserve"> Amharic (Native)</w:t>
+      </w:r>
+    </w:p>
+    <w:p>
+      <w:pPr>
+        <w:keepLines/>
+        <w:ind w:left="202" w:hanging="158"/>
+      </w:pPr>
       <w:r>
         <w:rPr>
-          <w:rFonts w:ascii="Times New Roman" w:hAnsi="Times New Roman" w:cs="Times New Roman"/>
-          <w:b/>
           <w:bCs/>
         </w:rPr>
-        <w:t xml:space="preserve"> XAI, and </w:t>
-      </w:r>
-      <w:proofErr w:type="spellStart"/>
-      <w:r>
-        <w:rPr>
-          <w:rFonts w:ascii="Times New Roman" w:hAnsi="Times New Roman" w:cs="Times New Roman"/>
-          <w:b/>
-          <w:bCs/>
-        </w:rPr>
-        <w:t>EdTech</w:t>
-      </w:r>
-      <w:proofErr w:type="spellEnd"/>
-      <w:r>
-        <w:rPr>
-          <w:rFonts w:ascii="Times New Roman" w:hAnsi="Times New Roman" w:cs="Times New Roman"/>
-          <w:b/>
-          <w:bCs/>
-        </w:rPr>
-        <w:t xml:space="preserve"> platforms</w:t>
-      </w:r>
-      <w:r>
-        <w:rPr>
-          <w:rFonts w:ascii="Times New Roman" w:hAnsi="Times New Roman" w:cs="Times New Roman"/>
-        </w:rPr>
-        <w:t xml:space="preserve">, with experience in </w:t>
-      </w:r>
-      <w:r>
-        <w:rPr>
-          <w:rFonts w:ascii="Times New Roman" w:hAnsi="Times New Roman" w:cs="Times New Roman"/>
-          <w:b/>
-          <w:bCs/>
-        </w:rPr>
-        <w:t>backend development, database design, API development, responsive web development, cross-platform mobile development, and software architecture</w:t>
-      </w:r>
-      <w:r>
-        <w:rPr>
-          <w:rFonts w:ascii="Times New Roman" w:hAnsi="Times New Roman" w:cs="Times New Roman"/>
-        </w:rPr>
-        <w:t xml:space="preserve">. Strong focus on </w:t>
-      </w:r>
-      <w:r>
-        <w:rPr>
-          <w:rFonts w:ascii="Times New Roman" w:hAnsi="Times New Roman" w:cs="Times New Roman"/>
-          <w:b/>
-          <w:bCs/>
-        </w:rPr>
-        <w:t>clean code, maintainability, application performance, security, and user experience</w:t>
-      </w:r>
-      <w:r>
-        <w:rPr>
-          <w:rFonts w:ascii="Times New Roman" w:hAnsi="Times New Roman" w:cs="Times New Roman"/>
-        </w:rPr>
-        <w:t xml:space="preserve">. </w:t>
-      </w:r>
-      <w:r>
-        <w:rPr>
-          <w:rFonts w:ascii="Times New Roman" w:hAnsi="Times New Roman" w:cs="Times New Roman"/>
-          <w:b/>
-          <w:bCs/>
-        </w:rPr>
-        <w:t>Founder, hackathon organizer, and technical mentor</w:t>
-      </w:r>
-      <w:r>
-        <w:rPr>
-          <w:rFonts w:ascii="Times New Roman" w:hAnsi="Times New Roman" w:cs="Times New Roman"/>
-        </w:rPr>
-        <w:t xml:space="preserve">, actively involved in </w:t>
-      </w:r>
-      <w:r>
-        <w:rPr>
-          <w:rFonts w:ascii="Times New Roman" w:hAnsi="Times New Roman" w:cs="Times New Roman"/>
-          <w:b/>
-          <w:bCs/>
-        </w:rPr>
-        <w:t>technology communities and collaborative software development</w:t>
-      </w:r>
-      <w:r>
-        <w:rPr>
-          <w:rFonts w:ascii="Times New Roman" w:hAnsi="Times New Roman" w:cs="Times New Roman"/>
-        </w:rPr>
-        <w:t xml:space="preserve"> across East Africa and remote teams.</w:t>
+        <w:t>•</w:t>
+      </w:r>
+      <w:r>
+        <w:t xml:space="preserve"> English (Professional Working Proficiency)</w:t>
       </w:r>
     </w:p>
     <w:p>
       <w:pPr>
-        <w:spacing w:before="240" w:after="80"/>
-        <w:rPr>
-          <w:rFonts w:ascii="Times New Roman" w:hAnsi="Times New Roman" w:cs="Times New Roman"/>
-        </w:rPr>
-      </w:pPr>
-      <w:r>
-        <w:rPr>
-          <w:rFonts w:ascii="Times New Roman" w:hAnsi="Times New Roman" w:cs="Times New Roman"/>
-          <w:b/>
-          <w:sz w:val="26"/>
-        </w:rPr>
-        <w:t>EDUCATION</w:t>
-      </w:r>
-    </w:p>
-    <w:p>
-      <w:pPr>
-        <w:spacing w:before="120" w:after="40"/>
-        <w:rPr>
-          <w:rFonts w:ascii="Times New Roman" w:hAnsi="Times New Roman" w:cs="Times New Roman"/>
-        </w:rPr>
-      </w:pPr>
-      <w:r>
-        <w:rPr>
-          <w:rFonts w:ascii="Times New Roman" w:hAnsi="Times New Roman" w:cs="Times New Roman"/>
-          <w:b/>
-        </w:rPr>
-        <w:t>Bachelor of Science in Information Systems</w:t>
-      </w:r>
-    </w:p>
-    <w:p>
-      <w:pPr>
-        <w:spacing w:after="80"/>
-        <w:rPr>
-          <w:rFonts w:ascii="Times New Roman" w:hAnsi="Times New Roman" w:cs="Times New Roman"/>
-        </w:rPr>
-      </w:pPr>
-      <w:r>
-        <w:rPr>
-          <w:rFonts w:ascii="Times New Roman" w:hAnsi="Times New Roman" w:cs="Times New Roman"/>
-          <w:b/>
-          <w:sz w:val="20"/>
-        </w:rPr>
-        <w:t>Bahir Dar Institute of Technology (BiT), Bahir Dar University</w:t>
-      </w:r>
-    </w:p>
-    <w:p>
-      <w:pPr>
-        <w:pStyle w:val="ListBullet"/>
-        <w:spacing w:after="60"/>
-        <w:rPr>
-          <w:rFonts w:ascii="Times New Roman" w:hAnsi="Times New Roman" w:cs="Times New Roman"/>
-        </w:rPr>
-      </w:pPr>
-      <w:r>
-        <w:rPr>
-          <w:rFonts w:ascii="Times New Roman" w:hAnsi="Times New Roman" w:cs="Times New Roman"/>
-          <w:b/>
-          <w:sz w:val="20"/>
-        </w:rPr>
-        <w:t>Relevant Coursework:</w:t>
-      </w:r>
-      <w:r>
-        <w:rPr>
-          <w:rFonts w:ascii="Times New Roman" w:hAnsi="Times New Roman" w:cs="Times New Roman"/>
-          <w:sz w:val="20"/>
-        </w:rPr>
-        <w:t xml:space="preserve"> Data Structures &amp; Algorithms, Object-Oriented Programming (OOP), C++, Java, C#, Python, JavaScript, Machine Learning, Mobile App Development</w:t>
-      </w:r>
-      <w:r>
-        <w:rPr>
-          <w:rFonts w:ascii="Times New Roman" w:hAnsi="Times New Roman" w:cs="Times New Roman"/>
-          <w:sz w:val="20"/>
-        </w:rPr>
-        <w:t xml:space="preserve">, </w:t>
-      </w:r>
+        <w:keepLines/>
+        <w:ind w:left="202" w:hanging="158"/>
+      </w:pPr>
       <w:bookmarkStart w:id="0" w:name="_GoBack"/>
       <w:bookmarkEnd w:id="0"/>
-      <w:r>
-        <w:rPr>
-          <w:rFonts w:ascii="Times New Roman" w:hAnsi="Times New Roman" w:cs="Times New Roman"/>
-          <w:sz w:val="20"/>
-        </w:rPr>
-        <w:t>Operating Systems</w:t>
-      </w:r>
-      <w:r>
-        <w:rPr>
-          <w:rFonts w:ascii="Times New Roman" w:hAnsi="Times New Roman" w:cs="Times New Roman"/>
-          <w:sz w:val="20"/>
-        </w:rPr>
-        <w:t>.</w:t>
-      </w:r>
-    </w:p>
-    <w:p>
-      <w:pPr>
-        <w:pStyle w:val="ListBullet"/>
-        <w:spacing w:after="60"/>
-        <w:rPr>
-          <w:rFonts w:ascii="Times New Roman" w:hAnsi="Times New Roman" w:cs="Times New Roman"/>
-        </w:rPr>
-      </w:pPr>
-      <w:r>
-        <w:rPr>
-          <w:rFonts w:ascii="Times New Roman" w:hAnsi="Times New Roman" w:cs="Times New Roman"/>
-          <w:b/>
-          <w:sz w:val="20"/>
-        </w:rPr>
-        <w:t>Key Highlights:</w:t>
-      </w:r>
-      <w:r>
-        <w:rPr>
-          <w:rFonts w:ascii="Times New Roman" w:hAnsi="Times New Roman" w:cs="Times New Roman"/>
-          <w:sz w:val="20"/>
-        </w:rPr>
-        <w:t xml:space="preserve"> Recognized for </w:t>
-      </w:r>
-      <w:r>
-        <w:rPr>
-          <w:rFonts w:ascii="Times New Roman" w:hAnsi="Times New Roman" w:cs="Times New Roman"/>
-          <w:b/>
-          <w:sz w:val="20"/>
-        </w:rPr>
-        <w:t>Best Top 3 Internship Project of 2025</w:t>
-      </w:r>
-      <w:r>
-        <w:rPr>
-          <w:rFonts w:ascii="Times New Roman" w:hAnsi="Times New Roman" w:cs="Times New Roman"/>
-          <w:sz w:val="20"/>
-        </w:rPr>
-        <w:t xml:space="preserve"> and </w:t>
-      </w:r>
-      <w:r>
-        <w:rPr>
-          <w:rFonts w:ascii="Times New Roman" w:hAnsi="Times New Roman" w:cs="Times New Roman"/>
-          <w:b/>
-          <w:sz w:val="20"/>
-        </w:rPr>
-        <w:t>3rd Place Winner</w:t>
-      </w:r>
-      <w:r>
-        <w:rPr>
-          <w:rFonts w:ascii="Times New Roman" w:hAnsi="Times New Roman" w:cs="Times New Roman"/>
-          <w:sz w:val="20"/>
-        </w:rPr>
-        <w:t xml:space="preserve"> at BiT AI Hackathon.</w:t>
-      </w:r>
-    </w:p>
-    <w:p>
-      <w:pPr>
-        <w:pStyle w:val="ListBullet"/>
-        <w:spacing w:after="60"/>
-        <w:rPr>
-          <w:rFonts w:ascii="Times New Roman" w:hAnsi="Times New Roman" w:cs="Times New Roman"/>
-        </w:rPr>
-      </w:pPr>
-      <w:r/>
-      <w:r>
-        <w:t xml:space="preserve">Student Leadership: Founder &amp; Lead of </w:t>
-      </w:r>
-      <w:r>
-        <w:rPr>
-          <w:i/>
-        </w:rPr>
-        <w:t>Meta Codz BiT</w:t>
-      </w:r>
-      <w:r>
-        <w:t xml:space="preserve">, Lead Organizer of </w:t>
-      </w:r>
-      <w:r>
-        <w:rPr>
-          <w:i/>
-        </w:rPr>
-        <w:t>Cursor Hackathon</w:t>
-      </w:r>
-      <w:r>
-        <w:t>.</w:t>
-      </w:r>
-    </w:p>
-    <w:p>
-      <w:pPr>
-        <w:spacing w:before="120" w:after="40"/>
-        <w:rPr>
-          <w:rFonts w:ascii="Times New Roman" w:hAnsi="Times New Roman" w:cs="Times New Roman"/>
-        </w:rPr>
-      </w:pPr>
-      <w:r>
-        <w:rPr>
-          <w:rFonts w:ascii="Times New Roman" w:hAnsi="Times New Roman" w:cs="Times New Roman"/>
-          <w:b/>
-        </w:rPr>
-        <w:t>Scholarships &amp; Intensive Technical Certifications</w:t>
-      </w:r>
-    </w:p>
-    <w:p>
-      <w:pPr>
-        <w:pStyle w:val="ListBullet"/>
-        <w:spacing w:after="60"/>
-        <w:rPr>
-          <w:rFonts w:ascii="Times New Roman" w:hAnsi="Times New Roman" w:cs="Times New Roman"/>
-        </w:rPr>
-      </w:pPr>
-      <w:r/>
-      <w:r>
-        <w:t xml:space="preserve">PLP Software Development Scholarship — </w:t>
-      </w:r>
-      <w:r>
-        <w:rPr>
-          <w:i/>
-        </w:rPr>
-        <w:t>Power Learn Project</w:t>
-      </w:r>
-    </w:p>
-    <w:p>
-      <w:pPr>
-        <w:pStyle w:val="ListBullet"/>
-        <w:spacing w:after="60"/>
-        <w:rPr>
-          <w:rFonts w:ascii="Times New Roman" w:hAnsi="Times New Roman" w:cs="Times New Roman"/>
-        </w:rPr>
-      </w:pPr>
-      <w:r/>
-      <w:r>
-        <w:t xml:space="preserve">Backend Bootcamp Engineer Certification — </w:t>
-      </w:r>
-      <w:r>
-        <w:rPr>
-          <w:i/>
-        </w:rPr>
-        <w:t>IS HUB, Addis Ababa University</w:t>
-      </w:r>
-    </w:p>
-    <w:p>
-      <w:pPr>
-        <w:pStyle w:val="ListBullet"/>
-        <w:spacing w:after="60"/>
-        <w:rPr>
-          <w:rFonts w:ascii="Times New Roman" w:hAnsi="Times New Roman" w:cs="Times New Roman"/>
-        </w:rPr>
-      </w:pPr>
-      <w:r/>
-      <w:r>
-        <w:t xml:space="preserve">Fundamentals of Web Development Certification — </w:t>
-      </w:r>
-      <w:r>
-        <w:rPr>
-          <w:i/>
-        </w:rPr>
-        <w:t>Udacity</w:t>
-      </w:r>
-    </w:p>
-    <w:p>
-      <w:pPr>
-        <w:pStyle w:val="ListBullet"/>
-        <w:spacing w:after="60"/>
-        <w:rPr>
-          <w:rFonts w:ascii="Times New Roman" w:hAnsi="Times New Roman" w:cs="Times New Roman"/>
-        </w:rPr>
-      </w:pPr>
-      <w:r/>
-      <w:r>
-        <w:t xml:space="preserve">English Language &amp; Professional Communication Trainee — </w:t>
-      </w:r>
-      <w:r>
-        <w:rPr>
-          <w:i/>
-        </w:rPr>
-        <w:t>ELIC</w:t>
-      </w:r>
-    </w:p>
-    <w:p>
-      <w:pPr>
-        <w:pStyle w:val="ListBullet"/>
-        <w:spacing w:after="60"/>
-        <w:rPr>
-          <w:rFonts w:ascii="Times New Roman" w:hAnsi="Times New Roman" w:cs="Times New Roman"/>
-        </w:rPr>
-      </w:pPr>
-      <w:r/>
-      <w:r>
-        <w:t xml:space="preserve">Leadership &amp; Strategy Programs — </w:t>
-      </w:r>
-      <w:r>
-        <w:rPr>
-          <w:i/>
-        </w:rPr>
-        <w:t>Various Leadership Development Initiatives</w:t>
-      </w:r>
-    </w:p>
-    <w:p>
-      <w:pPr>
-        <w:spacing w:before="240" w:after="80"/>
-        <w:rPr>
-          <w:rFonts w:ascii="Times New Roman" w:hAnsi="Times New Roman" w:cs="Times New Roman"/>
-        </w:rPr>
-      </w:pPr>
-      <w:r>
-        <w:rPr>
-          <w:rFonts w:ascii="Times New Roman" w:hAnsi="Times New Roman" w:cs="Times New Roman"/>
-          <w:b/>
-          <w:sz w:val="26"/>
-        </w:rPr>
-        <w:t>WORK EXPERIENCE</w:t>
-      </w:r>
-    </w:p>
-    <w:p>
-      <w:pPr>
-        <w:spacing w:before="120" w:after="40"/>
-        <w:rPr>
-          <w:rFonts w:ascii="Times New Roman" w:hAnsi="Times New Roman" w:cs="Times New Roman"/>
-        </w:rPr>
-      </w:pPr>
-      <w:r>
-        <w:rPr>
-          <w:rFonts w:ascii="Times New Roman" w:hAnsi="Times New Roman" w:cs="Times New Roman"/>
-          <w:b/>
-        </w:rPr>
-        <w:t>Full-Stack Engineer</w:t>
-      </w:r>
-    </w:p>
-    <w:p>
-      <w:pPr>
-        <w:spacing w:after="80"/>
-        <w:rPr>
-          <w:rFonts w:ascii="Times New Roman" w:hAnsi="Times New Roman" w:cs="Times New Roman"/>
-        </w:rPr>
-      </w:pPr>
-      <w:r/>
-      <w:r>
-        <w:t xml:space="preserve">Ethiopian Optometric Association | </w:t>
-      </w:r>
-      <w:r>
-        <w:rPr>
-          <w:i/>
-        </w:rPr>
-        <w:t>Sep 2025 — Present</w:t>
-      </w:r>
-    </w:p>
-    <w:p>
-      <w:pPr>
-        <w:pStyle w:val="ListBullet"/>
-        <w:spacing w:after="60"/>
-        <w:rPr>
-          <w:rFonts w:ascii="Times New Roman" w:hAnsi="Times New Roman" w:cs="Times New Roman"/>
-        </w:rPr>
-      </w:pPr>
-      <w:r>
-        <w:rPr>
-          <w:rFonts w:ascii="Times New Roman" w:hAnsi="Times New Roman" w:cs="Times New Roman"/>
-          <w:sz w:val="20"/>
-        </w:rPr>
-        <w:t>Architected and deployed the official full-stack web platform powering digital operations, admin management tools, and member services across Ethiopia.</w:t>
-      </w:r>
-    </w:p>
-    <w:p>
-      <w:pPr>
-        <w:pStyle w:val="ListBullet"/>
-        <w:spacing w:after="60"/>
-        <w:rPr>
-          <w:rFonts w:ascii="Times New Roman" w:hAnsi="Times New Roman" w:cs="Times New Roman"/>
-        </w:rPr>
-      </w:pPr>
-      <w:r>
-        <w:rPr>
-          <w:rFonts w:ascii="Times New Roman" w:hAnsi="Times New Roman" w:cs="Times New Roman"/>
-          <w:sz w:val="20"/>
-        </w:rPr>
-        <w:t xml:space="preserve">Engineered secure </w:t>
-      </w:r>
-      <w:r>
-        <w:rPr>
-          <w:rFonts w:ascii="Times New Roman" w:hAnsi="Times New Roman" w:cs="Times New Roman"/>
-          <w:b/>
-          <w:sz w:val="20"/>
-        </w:rPr>
-        <w:t>Role-Based Access Control (RBAC)</w:t>
-      </w:r>
-      <w:r>
-        <w:rPr>
-          <w:rFonts w:ascii="Times New Roman" w:hAnsi="Times New Roman" w:cs="Times New Roman"/>
-          <w:sz w:val="20"/>
-        </w:rPr>
-        <w:t xml:space="preserve"> authentication (JWT, OAuth) and automated digital credentialing with dynamic </w:t>
-      </w:r>
-      <w:r>
-        <w:rPr>
-          <w:rFonts w:ascii="Times New Roman" w:hAnsi="Times New Roman" w:cs="Times New Roman"/>
-          <w:b/>
-          <w:sz w:val="20"/>
-        </w:rPr>
-        <w:t>PDF generation (PDFKit)</w:t>
-      </w:r>
-      <w:r>
-        <w:rPr>
-          <w:rFonts w:ascii="Times New Roman" w:hAnsi="Times New Roman" w:cs="Times New Roman"/>
-          <w:sz w:val="20"/>
-        </w:rPr>
-        <w:t xml:space="preserve"> and </w:t>
-      </w:r>
-      <w:r>
-        <w:rPr>
-          <w:rFonts w:ascii="Times New Roman" w:hAnsi="Times New Roman" w:cs="Times New Roman"/>
-          <w:b/>
-          <w:sz w:val="20"/>
-        </w:rPr>
-        <w:t>QR code verification</w:t>
-      </w:r>
-      <w:r>
-        <w:rPr>
-          <w:rFonts w:ascii="Times New Roman" w:hAnsi="Times New Roman" w:cs="Times New Roman"/>
-          <w:sz w:val="20"/>
-        </w:rPr>
-        <w:t>.</w:t>
-      </w:r>
-    </w:p>
-    <w:p>
-      <w:pPr>
-        <w:pStyle w:val="ListBullet"/>
-        <w:spacing w:after="60"/>
-        <w:rPr>
-          <w:rFonts w:ascii="Times New Roman" w:hAnsi="Times New Roman" w:cs="Times New Roman"/>
-        </w:rPr>
-      </w:pPr>
-      <w:r>
-        <w:rPr>
-          <w:rFonts w:ascii="Times New Roman" w:hAnsi="Times New Roman" w:cs="Times New Roman"/>
-          <w:sz w:val="20"/>
-        </w:rPr>
-        <w:t>Optimized database architecture using MySQL and Sequelize ORM, integrating Cloudinary for asset storage and automated cloud backups.</w:t>
-      </w:r>
-    </w:p>
-    <w:p>
-      <w:pPr>
-        <w:spacing w:before="120" w:after="40"/>
-        <w:rPr>
-          <w:rFonts w:ascii="Times New Roman" w:hAnsi="Times New Roman" w:cs="Times New Roman"/>
-        </w:rPr>
-      </w:pPr>
-      <w:r>
-        <w:rPr>
-          <w:rFonts w:ascii="Times New Roman" w:hAnsi="Times New Roman" w:cs="Times New Roman"/>
-          <w:b/>
-        </w:rPr>
-        <w:t>Project Team Lead, Web Developer &amp; UI/UX Designer</w:t>
-      </w:r>
-    </w:p>
-    <w:p>
-      <w:pPr>
-        <w:spacing w:after="80"/>
-        <w:rPr>
-          <w:rFonts w:ascii="Times New Roman" w:hAnsi="Times New Roman" w:cs="Times New Roman"/>
-        </w:rPr>
-      </w:pPr>
-      <w:r/>
-      <w:r>
-        <w:t xml:space="preserve">BiTech Incubation Center | </w:t>
-      </w:r>
-      <w:r>
-        <w:rPr>
-          <w:i/>
-        </w:rPr>
-        <w:t>May 2025 — Jul 2026</w:t>
-      </w:r>
-    </w:p>
-    <w:p>
-      <w:pPr>
-        <w:pStyle w:val="ListBullet"/>
-        <w:spacing w:after="60"/>
-        <w:rPr>
-          <w:rFonts w:ascii="Times New Roman" w:hAnsi="Times New Roman" w:cs="Times New Roman"/>
-        </w:rPr>
-      </w:pPr>
-      <w:r>
-        <w:rPr>
-          <w:rFonts w:ascii="Times New Roman" w:hAnsi="Times New Roman" w:cs="Times New Roman"/>
-          <w:sz w:val="20"/>
-        </w:rPr>
-        <w:t>Lead multidisciplinary engineering and design team in developing software products for incubated tech startups.</w:t>
-      </w:r>
-    </w:p>
-    <w:p>
-      <w:pPr>
-        <w:pStyle w:val="ListBullet"/>
-        <w:spacing w:after="60"/>
-        <w:rPr>
-          <w:rFonts w:ascii="Times New Roman" w:hAnsi="Times New Roman" w:cs="Times New Roman"/>
-        </w:rPr>
-      </w:pPr>
-      <w:r>
-        <w:rPr>
-          <w:rFonts w:ascii="Times New Roman" w:hAnsi="Times New Roman" w:cs="Times New Roman"/>
-          <w:sz w:val="20"/>
-        </w:rPr>
-        <w:lastRenderedPageBreak/>
-        <w:t>Direct visual identity, UI/UX prototyping (Figma), and full-stack web development across multiple concurrent projects.</w:t>
-      </w:r>
-    </w:p>
-    <w:p>
-      <w:pPr>
-        <w:pStyle w:val="ListBullet"/>
-        <w:spacing w:after="60"/>
-        <w:rPr>
-          <w:rFonts w:ascii="Times New Roman" w:hAnsi="Times New Roman" w:cs="Times New Roman"/>
-        </w:rPr>
-      </w:pPr>
-      <w:r>
-        <w:rPr>
-          <w:rFonts w:ascii="Times New Roman" w:hAnsi="Times New Roman" w:cs="Times New Roman"/>
-          <w:sz w:val="20"/>
-        </w:rPr>
-        <w:t>Facilitate stakeholder planning, sprint retrospectives, and technical architecture reviews.</w:t>
-      </w:r>
-    </w:p>
-    <w:p>
-      <w:pPr>
-        <w:spacing w:before="120" w:after="40"/>
-        <w:rPr>
-          <w:rFonts w:ascii="Times New Roman" w:hAnsi="Times New Roman" w:cs="Times New Roman"/>
-        </w:rPr>
-      </w:pPr>
-      <w:r>
-        <w:rPr>
-          <w:rFonts w:ascii="Times New Roman" w:hAnsi="Times New Roman" w:cs="Times New Roman"/>
-          <w:b/>
-        </w:rPr>
-        <w:t>Frontend &amp; SEO Developer / Full-Stack Intern</w:t>
-      </w:r>
-    </w:p>
-    <w:p>
-      <w:pPr>
-        <w:spacing w:after="80"/>
-        <w:rPr>
-          <w:rFonts w:ascii="Times New Roman" w:hAnsi="Times New Roman" w:cs="Times New Roman"/>
-        </w:rPr>
-      </w:pPr>
-      <w:r/>
-      <w:r>
-        <w:t xml:space="preserve">Askuala Link | </w:t>
-      </w:r>
-      <w:r>
-        <w:rPr>
-          <w:i/>
-        </w:rPr>
-        <w:t>Jul 2025 — Mar 2026</w:t>
-      </w:r>
-    </w:p>
-    <w:p>
-      <w:pPr>
-        <w:pStyle w:val="ListBullet"/>
-        <w:spacing w:after="60"/>
-        <w:rPr>
-          <w:rFonts w:ascii="Times New Roman" w:hAnsi="Times New Roman" w:cs="Times New Roman"/>
-        </w:rPr>
-      </w:pPr>
-      <w:r/>
-      <w:r>
-        <w:t>Frontend &amp; SEO Developer (</w:t>
-      </w:r>
-      <w:r>
-        <w:rPr>
-          <w:i/>
-        </w:rPr>
-        <w:t>Oct 2025 — Mar 2026</w:t>
-      </w:r>
-      <w:r>
-        <w:t>): Engineered responsive frontend interfaces and implemented SEO best practices (meta tags, site indexing, Core Web Vitals) for the main public portal (`askualalink.com`).</w:t>
-      </w:r>
-    </w:p>
-    <w:p>
-      <w:pPr>
-        <w:pStyle w:val="ListBullet"/>
-        <w:spacing w:after="60"/>
-        <w:rPr>
-          <w:rFonts w:ascii="Times New Roman" w:hAnsi="Times New Roman" w:cs="Times New Roman"/>
-        </w:rPr>
-      </w:pPr>
-      <w:r/>
-      <w:r>
-        <w:t>Full-Stack Developer Intern (</w:t>
-      </w:r>
-      <w:r>
-        <w:rPr>
-          <w:i/>
-        </w:rPr>
-        <w:t>Jul 2025 — Oct 2025</w:t>
-      </w:r>
-      <w:r>
-        <w:t>): Architected Askuala Wiki, an internal knowledge platform built with React 19, Tailwind CSS v4, Zustand, Node.js, Express, MySQL, and Cloudinary.</w:t>
-      </w:r>
-    </w:p>
-    <w:p>
-      <w:pPr>
-        <w:pStyle w:val="ListBullet"/>
-        <w:spacing w:after="60"/>
-        <w:rPr>
-          <w:rFonts w:ascii="Times New Roman" w:hAnsi="Times New Roman" w:cs="Times New Roman"/>
-        </w:rPr>
-      </w:pPr>
-      <w:r>
-        <w:rPr>
-          <w:rFonts w:ascii="Times New Roman" w:hAnsi="Times New Roman" w:cs="Times New Roman"/>
-          <w:sz w:val="20"/>
-        </w:rPr>
-        <w:t>Awarded special commendation by Founder &amp; CEO for outstanding technical contributions and innovation.</w:t>
-      </w:r>
-    </w:p>
-    <w:p>
-      <w:pPr>
-        <w:spacing w:before="120" w:after="40"/>
-        <w:rPr>
-          <w:rFonts w:ascii="Times New Roman" w:hAnsi="Times New Roman" w:cs="Times New Roman"/>
-        </w:rPr>
-      </w:pPr>
-      <w:r>
-        <w:rPr>
-          <w:rFonts w:ascii="Times New Roman" w:hAnsi="Times New Roman" w:cs="Times New Roman"/>
-          <w:b/>
-        </w:rPr>
-        <w:t>Backend Developer Intern</w:t>
-      </w:r>
-    </w:p>
-    <w:p>
-      <w:pPr>
-        <w:spacing w:after="80"/>
-        <w:rPr>
-          <w:rFonts w:ascii="Times New Roman" w:hAnsi="Times New Roman" w:cs="Times New Roman"/>
-        </w:rPr>
-      </w:pPr>
-      <w:r/>
-      <w:r>
-        <w:t xml:space="preserve">Alyah Software | </w:t>
-      </w:r>
-      <w:r>
-        <w:rPr>
-          <w:i/>
-        </w:rPr>
-        <w:t>Jun 2025 — Aug 2025</w:t>
-      </w:r>
-    </w:p>
-    <w:p>
-      <w:pPr>
-        <w:pStyle w:val="ListBullet"/>
-        <w:spacing w:after="60"/>
-        <w:rPr>
-          <w:rFonts w:ascii="Times New Roman" w:hAnsi="Times New Roman" w:cs="Times New Roman"/>
-        </w:rPr>
-      </w:pPr>
-      <w:r>
-        <w:rPr>
-          <w:rFonts w:ascii="Times New Roman" w:hAnsi="Times New Roman" w:cs="Times New Roman"/>
-          <w:sz w:val="20"/>
-        </w:rPr>
-        <w:t xml:space="preserve">Built the backend services and API infrastructure for </w:t>
-      </w:r>
-      <w:r>
-        <w:rPr>
-          <w:rFonts w:ascii="Times New Roman" w:hAnsi="Times New Roman" w:cs="Times New Roman"/>
-          <w:b/>
-          <w:sz w:val="20"/>
-        </w:rPr>
-        <w:t>Hintern Bridge</w:t>
-      </w:r>
-      <w:r>
-        <w:rPr>
-          <w:rFonts w:ascii="Times New Roman" w:hAnsi="Times New Roman" w:cs="Times New Roman"/>
-          <w:sz w:val="20"/>
-        </w:rPr>
-        <w:t>, an internship-matching platform connecting university students with tech companies.</w:t>
-      </w:r>
-    </w:p>
-    <w:p>
-      <w:pPr>
-        <w:pStyle w:val="ListBullet"/>
-        <w:spacing w:after="60"/>
-        <w:rPr>
-          <w:rFonts w:ascii="Times New Roman" w:hAnsi="Times New Roman" w:cs="Times New Roman"/>
-        </w:rPr>
-      </w:pPr>
-      <w:r>
-        <w:rPr>
-          <w:rFonts w:ascii="Times New Roman" w:hAnsi="Times New Roman" w:cs="Times New Roman"/>
-          <w:sz w:val="20"/>
-        </w:rPr>
-        <w:t>Developed scalable RESTful APIs, database models, and intelligent candidate-matching logic.</w:t>
-      </w:r>
-    </w:p>
-    <w:p>
-      <w:pPr>
-        <w:spacing w:before="120" w:after="40"/>
-        <w:rPr>
-          <w:rFonts w:ascii="Times New Roman" w:hAnsi="Times New Roman" w:cs="Times New Roman"/>
-        </w:rPr>
-      </w:pPr>
-      <w:r>
-        <w:rPr>
-          <w:rFonts w:ascii="Times New Roman" w:hAnsi="Times New Roman" w:cs="Times New Roman"/>
-          <w:b/>
-        </w:rPr>
-        <w:t>Co-Founder &amp; CTO</w:t>
-      </w:r>
-    </w:p>
-    <w:p>
-      <w:pPr>
-        <w:spacing w:after="80"/>
-        <w:rPr>
-          <w:rFonts w:ascii="Times New Roman" w:hAnsi="Times New Roman" w:cs="Times New Roman"/>
-        </w:rPr>
-      </w:pPr>
-      <w:r/>
-      <w:r>
-        <w:t xml:space="preserve">Code Biruh | </w:t>
-      </w:r>
-      <w:r>
-        <w:rPr>
-          <w:i/>
-        </w:rPr>
-        <w:t>2024 — 2025</w:t>
-      </w:r>
-    </w:p>
-    <w:p>
-      <w:pPr>
-        <w:pStyle w:val="ListBullet"/>
-        <w:spacing w:after="60"/>
-        <w:rPr>
-          <w:rFonts w:ascii="Times New Roman" w:hAnsi="Times New Roman" w:cs="Times New Roman"/>
-        </w:rPr>
-      </w:pPr>
-      <w:r>
-        <w:rPr>
-          <w:rFonts w:ascii="Times New Roman" w:hAnsi="Times New Roman" w:cs="Times New Roman"/>
-          <w:sz w:val="20"/>
-        </w:rPr>
-        <w:t>Directed technical strategy, client web development projects, and curriculum design for developer training programs.</w:t>
-      </w:r>
-    </w:p>
-    <w:p>
-      <w:pPr>
-        <w:pStyle w:val="ListBullet"/>
-        <w:spacing w:after="60"/>
-        <w:rPr>
-          <w:rFonts w:ascii="Times New Roman" w:hAnsi="Times New Roman" w:cs="Times New Roman"/>
-        </w:rPr>
-      </w:pPr>
-      <w:r>
-        <w:rPr>
-          <w:rFonts w:ascii="Times New Roman" w:hAnsi="Times New Roman" w:cs="Times New Roman"/>
-          <w:sz w:val="20"/>
-        </w:rPr>
-        <w:t>Trained aspiring developers in core programming principles while delivering custom web solutions for local businesses and organizations.</w:t>
-      </w:r>
-    </w:p>
-    <w:p>
-      <w:pPr>
-        <w:spacing w:before="120" w:after="40"/>
-        <w:rPr>
-          <w:rFonts w:ascii="Times New Roman" w:hAnsi="Times New Roman" w:cs="Times New Roman"/>
-        </w:rPr>
-      </w:pPr>
-      <w:r>
-        <w:rPr>
-          <w:rFonts w:ascii="Times New Roman" w:hAnsi="Times New Roman" w:cs="Times New Roman"/>
-          <w:b/>
-        </w:rPr>
-        <w:t>Web Development Intern</w:t>
-      </w:r>
-    </w:p>
-    <w:p>
-      <w:pPr>
-        <w:spacing w:after="80"/>
-        <w:rPr>
-          <w:rFonts w:ascii="Times New Roman" w:hAnsi="Times New Roman" w:cs="Times New Roman"/>
-        </w:rPr>
-      </w:pPr>
-      <w:r/>
-      <w:r>
-        <w:t xml:space="preserve">Oasis Infobyte | </w:t>
-      </w:r>
-      <w:r>
-        <w:rPr>
-          <w:i/>
-        </w:rPr>
-        <w:t>Remote, India</w:t>
-      </w:r>
-      <w:r>
-        <w:t xml:space="preserve"> | </w:t>
-      </w:r>
-      <w:r>
-        <w:rPr>
-          <w:i/>
-        </w:rPr>
-        <w:t>Feb 2025 — Mar 2025</w:t>
-      </w:r>
-    </w:p>
-    <w:p>
-      <w:pPr>
-        <w:pStyle w:val="ListBullet"/>
-        <w:spacing w:after="60"/>
-        <w:rPr>
-          <w:rFonts w:ascii="Times New Roman" w:hAnsi="Times New Roman" w:cs="Times New Roman"/>
-        </w:rPr>
-      </w:pPr>
-      <w:r>
-        <w:rPr>
-          <w:rFonts w:ascii="Times New Roman" w:hAnsi="Times New Roman" w:cs="Times New Roman"/>
-          <w:sz w:val="20"/>
-        </w:rPr>
-        <w:t>Developed web applications solving real-world client requests in an agile, remote environment.</w:t>
-      </w:r>
-    </w:p>
-    <w:p>
-      <w:pPr>
-        <w:spacing w:before="120" w:after="40"/>
-        <w:rPr>
-          <w:rFonts w:ascii="Times New Roman" w:hAnsi="Times New Roman" w:cs="Times New Roman"/>
-        </w:rPr>
-      </w:pPr>
-      <w:r>
-        <w:rPr>
-          <w:rFonts w:ascii="Times New Roman" w:hAnsi="Times New Roman" w:cs="Times New Roman"/>
-          <w:b/>
-        </w:rPr>
-        <w:t>Web Development Intern</w:t>
-      </w:r>
-    </w:p>
-    <w:p>
-      <w:pPr>
-        <w:spacing w:after="80"/>
-        <w:rPr>
-          <w:rFonts w:ascii="Times New Roman" w:hAnsi="Times New Roman" w:cs="Times New Roman"/>
-        </w:rPr>
-      </w:pPr>
-      <w:r/>
-      <w:r>
-        <w:t xml:space="preserve">XAI | </w:t>
-      </w:r>
-      <w:r>
-        <w:rPr>
-          <w:i/>
-        </w:rPr>
-        <w:t>Remote, Morocco</w:t>
-      </w:r>
-      <w:r>
-        <w:t xml:space="preserve"> | </w:t>
-      </w:r>
-      <w:r>
-        <w:rPr>
-          <w:i/>
-        </w:rPr>
-        <w:t>Dec 2024 — Jan 2025</w:t>
-      </w:r>
-    </w:p>
-    <w:p>
-      <w:pPr>
-        <w:pStyle w:val="ListBullet"/>
-        <w:spacing w:after="60"/>
-        <w:rPr>
-          <w:rFonts w:ascii="Times New Roman" w:hAnsi="Times New Roman" w:cs="Times New Roman"/>
-        </w:rPr>
-      </w:pPr>
-      <w:r>
-        <w:rPr>
-          <w:rFonts w:ascii="Times New Roman" w:hAnsi="Times New Roman" w:cs="Times New Roman"/>
-          <w:sz w:val="20"/>
-        </w:rPr>
-        <w:t>Contributed to front-end and back-end web features for international clients with high performance standards.</w:t>
-      </w:r>
-    </w:p>
-    <w:p>
-      <w:pPr>
-        <w:spacing w:before="240" w:after="80"/>
-        <w:rPr>
-          <w:rFonts w:ascii="Times New Roman" w:hAnsi="Times New Roman" w:cs="Times New Roman"/>
-        </w:rPr>
-      </w:pPr>
-      <w:r>
-        <w:rPr>
-          <w:rFonts w:ascii="Times New Roman" w:hAnsi="Times New Roman" w:cs="Times New Roman"/>
-          <w:b/>
-          <w:sz w:val="26"/>
-        </w:rPr>
-        <w:t>SKILLS</w:t>
-      </w:r>
-    </w:p>
-    <w:p>
-      <w:pPr>
-        <w:pStyle w:val="ListBullet"/>
-        <w:spacing w:after="60"/>
-        <w:rPr>
-          <w:rFonts w:ascii="Times New Roman" w:hAnsi="Times New Roman" w:cs="Times New Roman"/>
-        </w:rPr>
-      </w:pPr>
-      <w:r>
-        <w:rPr>
-          <w:rFonts w:ascii="Times New Roman" w:hAnsi="Times New Roman" w:cs="Times New Roman"/>
-          <w:b/>
-          <w:sz w:val="20"/>
-        </w:rPr>
-        <w:t>Programming Languages:</w:t>
-      </w:r>
-      <w:r>
-        <w:rPr>
-          <w:rFonts w:ascii="Times New Roman" w:hAnsi="Times New Roman" w:cs="Times New Roman"/>
-          <w:sz w:val="20"/>
-        </w:rPr>
-        <w:t xml:space="preserve"> TypeScript, JavaScript, Python, C++, Dart, SQL, HTML5, CSS3</w:t>
-      </w:r>
-    </w:p>
-    <w:p>
-      <w:pPr>
-        <w:pStyle w:val="ListBullet"/>
-        <w:spacing w:after="60"/>
-        <w:rPr>
-          <w:rFonts w:ascii="Times New Roman" w:hAnsi="Times New Roman" w:cs="Times New Roman"/>
-        </w:rPr>
-      </w:pPr>
-      <w:r>
-        <w:rPr>
-          <w:rFonts w:ascii="Times New Roman" w:hAnsi="Times New Roman" w:cs="Times New Roman"/>
-          <w:b/>
-          <w:sz w:val="20"/>
-        </w:rPr>
-        <w:t>Frontend Engineering:</w:t>
-      </w:r>
-      <w:r>
-        <w:rPr>
-          <w:rFonts w:ascii="Times New Roman" w:hAnsi="Times New Roman" w:cs="Times New Roman"/>
-          <w:sz w:val="20"/>
-        </w:rPr>
-        <w:t xml:space="preserve"> React, Next.js, Nuxt.js, React Native, Flutter, Tailwind CSS (v3 &amp; v4), Zustand, Framer Motion, Radix UI, Responsive &amp; Accessible UI/UX Design</w:t>
-      </w:r>
-    </w:p>
-    <w:p>
-      <w:pPr>
-        <w:pStyle w:val="ListBullet"/>
-        <w:spacing w:after="60"/>
-        <w:rPr>
-          <w:rFonts w:ascii="Times New Roman" w:hAnsi="Times New Roman" w:cs="Times New Roman"/>
-        </w:rPr>
-      </w:pPr>
-      <w:r>
-        <w:rPr>
-          <w:rFonts w:ascii="Times New Roman" w:hAnsi="Times New Roman" w:cs="Times New Roman"/>
-          <w:b/>
-          <w:sz w:val="20"/>
-        </w:rPr>
-        <w:t>Backend Engineering &amp; Databases:</w:t>
-      </w:r>
-      <w:r>
-        <w:rPr>
-          <w:rFonts w:ascii="Times New Roman" w:hAnsi="Times New Roman" w:cs="Times New Roman"/>
-          <w:sz w:val="20"/>
-        </w:rPr>
-        <w:t xml:space="preserve"> Node.js, Express.js, PostgreSQL, MySQL, Prisma ORM, Sequelize ORM, RESTful APIs, WebSockets, GraphQL, Flask, g++ Live Compiler Integration</w:t>
-      </w:r>
-    </w:p>
-    <w:p>
-      <w:pPr>
-        <w:pStyle w:val="ListBullet"/>
-        <w:spacing w:after="60"/>
-        <w:rPr>
-          <w:rFonts w:ascii="Times New Roman" w:hAnsi="Times New Roman" w:cs="Times New Roman"/>
-        </w:rPr>
-      </w:pPr>
-      <w:r>
-        <w:rPr>
-          <w:rFonts w:ascii="Times New Roman" w:hAnsi="Times New Roman" w:cs="Times New Roman"/>
-          <w:b/>
-          <w:sz w:val="20"/>
-        </w:rPr>
-        <w:t>DevOps &amp; Infrastructure:</w:t>
-      </w:r>
-      <w:r>
-        <w:rPr>
-          <w:rFonts w:ascii="Times New Roman" w:hAnsi="Times New Roman" w:cs="Times New Roman"/>
-          <w:sz w:val="20"/>
-        </w:rPr>
-        <w:t xml:space="preserve"> Docker, AWS, GitHub Actions, Vercel, cPanel, Yegara Host, CI/CD Pipelines</w:t>
-      </w:r>
-    </w:p>
-    <w:p>
-      <w:pPr>
-        <w:pStyle w:val="ListBullet"/>
-        <w:spacing w:after="60"/>
-        <w:rPr>
-          <w:rFonts w:ascii="Times New Roman" w:hAnsi="Times New Roman" w:cs="Times New Roman"/>
-        </w:rPr>
-      </w:pPr>
-      <w:r>
-        <w:rPr>
-          <w:rFonts w:ascii="Times New Roman" w:hAnsi="Times New Roman" w:cs="Times New Roman"/>
-          <w:b/>
-          <w:sz w:val="20"/>
-        </w:rPr>
-        <w:t>Auth &amp; Security:</w:t>
-      </w:r>
-      <w:r>
-        <w:rPr>
-          <w:rFonts w:ascii="Times New Roman" w:hAnsi="Times New Roman" w:cs="Times New Roman"/>
-          <w:sz w:val="20"/>
-        </w:rPr>
-        <w:t xml:space="preserve"> Better Auth, JWT, OAuth 2.0, Role-Based Access Control (RBAC), Session Management, OWASP standards</w:t>
-      </w:r>
-    </w:p>
-    <w:p>
-      <w:pPr>
-        <w:pStyle w:val="ListBullet"/>
-        <w:spacing w:after="60"/>
-        <w:rPr>
-          <w:rFonts w:ascii="Times New Roman" w:hAnsi="Times New Roman" w:cs="Times New Roman"/>
-        </w:rPr>
-      </w:pPr>
-      <w:r>
-        <w:rPr>
-          <w:rFonts w:ascii="Times New Roman" w:hAnsi="Times New Roman" w:cs="Times New Roman"/>
-          <w:b/>
-          <w:sz w:val="20"/>
-        </w:rPr>
-        <w:t>AI &amp; Data Science:</w:t>
-      </w:r>
-      <w:r>
-        <w:rPr>
-          <w:rFonts w:ascii="Times New Roman" w:hAnsi="Times New Roman" w:cs="Times New Roman"/>
-          <w:sz w:val="20"/>
-        </w:rPr>
-        <w:t xml:space="preserve"> AI API Integration (Gemini AI, OpenAI), scikit-learn (IsolationForest anomaly detection), NumPy, Pandas, Data Analytics &amp; Visualization</w:t>
-      </w:r>
-    </w:p>
-    <w:p>
-      <w:pPr>
-        <w:pStyle w:val="ListBullet"/>
-        <w:spacing w:after="60"/>
-        <w:rPr>
-          <w:rFonts w:ascii="Times New Roman" w:hAnsi="Times New Roman" w:cs="Times New Roman"/>
-        </w:rPr>
-      </w:pPr>
-      <w:r>
-        <w:rPr>
-          <w:rFonts w:ascii="Times New Roman" w:hAnsi="Times New Roman" w:cs="Times New Roman"/>
-          <w:b/>
-          <w:sz w:val="20"/>
-        </w:rPr>
-        <w:t>UI/UX &amp; Creative Tools:</w:t>
-      </w:r>
-      <w:r>
-        <w:rPr>
-          <w:rFonts w:ascii="Times New Roman" w:hAnsi="Times New Roman" w:cs="Times New Roman"/>
-          <w:sz w:val="20"/>
-        </w:rPr>
-        <w:t xml:space="preserve"> Figma, Adobe XD, Illustrator, Premiere Pro, After Effects, Brand Identity Systems, Motion Graphics</w:t>
-      </w:r>
-    </w:p>
-    <w:p>
-      <w:pPr>
-        <w:spacing w:before="240" w:after="80"/>
-        <w:rPr>
-          <w:rFonts w:ascii="Times New Roman" w:hAnsi="Times New Roman" w:cs="Times New Roman"/>
-        </w:rPr>
-      </w:pPr>
-      <w:r>
-        <w:rPr>
-          <w:rFonts w:ascii="Times New Roman" w:hAnsi="Times New Roman" w:cs="Times New Roman"/>
-          <w:b/>
-          <w:sz w:val="26"/>
-        </w:rPr>
-        <w:t>PROJECTS</w:t>
-      </w:r>
-    </w:p>
-    <w:p>
-      <w:pPr>
-        <w:spacing w:before="120" w:after="40"/>
-        <w:rPr>
-          <w:rFonts w:ascii="Times New Roman" w:hAnsi="Times New Roman" w:cs="Times New Roman"/>
-        </w:rPr>
-      </w:pPr>
-      <w:r>
-        <w:rPr>
-          <w:rFonts w:ascii="Times New Roman" w:hAnsi="Times New Roman" w:cs="Times New Roman"/>
-          <w:b/>
-        </w:rPr>
-        <w:t>1. Ethiopian Optometric Association Platform</w:t>
-      </w:r>
-    </w:p>
-    <w:p>
-      <w:pPr>
-        <w:pStyle w:val="ListBullet"/>
-        <w:spacing w:after="60"/>
-        <w:rPr>
-          <w:rFonts w:ascii="Times New Roman" w:hAnsi="Times New Roman" w:cs="Times New Roman"/>
-        </w:rPr>
-      </w:pPr>
-      <w:r>
-        <w:rPr>
-          <w:rFonts w:ascii="Times New Roman" w:hAnsi="Times New Roman" w:cs="Times New Roman"/>
-          <w:b/>
-          <w:sz w:val="20"/>
-        </w:rPr>
-        <w:lastRenderedPageBreak/>
-        <w:t>Description:</w:t>
-      </w:r>
-      <w:r>
-        <w:rPr>
-          <w:rFonts w:ascii="Times New Roman" w:hAnsi="Times New Roman" w:cs="Times New Roman"/>
-          <w:sz w:val="20"/>
-        </w:rPr>
-        <w:t xml:space="preserve"> Enterprise full-stack digital operational system featuring role-based dashboards, membership management, dynamic payment audit workflows, automated PDF document issuance, and instant QR-based ID authentication.</w:t>
-      </w:r>
-    </w:p>
-    <w:p>
-      <w:pPr>
-        <w:pStyle w:val="ListBullet"/>
-        <w:spacing w:after="60"/>
-        <w:rPr>
-          <w:rFonts w:ascii="Times New Roman" w:hAnsi="Times New Roman" w:cs="Times New Roman"/>
-        </w:rPr>
-      </w:pPr>
-      <w:r>
-        <w:rPr>
-          <w:rFonts w:ascii="Times New Roman" w:hAnsi="Times New Roman" w:cs="Times New Roman"/>
-          <w:b/>
-          <w:sz w:val="20"/>
-        </w:rPr>
-        <w:t>Tech Stack:</w:t>
-      </w:r>
-      <w:r>
-        <w:rPr>
-          <w:rFonts w:ascii="Times New Roman" w:hAnsi="Times New Roman" w:cs="Times New Roman"/>
-          <w:sz w:val="20"/>
-        </w:rPr>
-        <w:t xml:space="preserve"> React, Node.js, Express.js, MySQL, Sequelize, JWT, Cloudinary, PDFKit, QRCode, Tailwind CSS</w:t>
-      </w:r>
-    </w:p>
-    <w:p>
-      <w:pPr>
-        <w:pStyle w:val="ListBullet"/>
-        <w:spacing w:after="60"/>
-        <w:rPr>
-          <w:rFonts w:ascii="Times New Roman" w:hAnsi="Times New Roman" w:cs="Times New Roman"/>
-        </w:rPr>
-      </w:pPr>
-      <w:r/>
-      <w:r>
-        <w:t xml:space="preserve">Live Demo: </w:t>
-      </w:r>
-      <w:hyperlink r:id="rId12">
-        <w:r>
-          <w:rPr>
-            <w:color w:val="0066CC"/>
-            <w:u w:val="single"/>
-          </w:rPr>
-          <w:t>ethiopianoptometricassociation.org</w:t>
-        </w:r>
-      </w:hyperlink>
-    </w:p>
-    <w:p>
-      <w:pPr>
-        <w:spacing w:before="120" w:after="40"/>
-        <w:rPr>
-          <w:rFonts w:ascii="Times New Roman" w:hAnsi="Times New Roman" w:cs="Times New Roman"/>
-        </w:rPr>
-      </w:pPr>
-      <w:r>
-        <w:rPr>
-          <w:rFonts w:ascii="Times New Roman" w:hAnsi="Times New Roman" w:cs="Times New Roman"/>
-          <w:b/>
-        </w:rPr>
-        <w:t>2. AlphaX EdTech &amp; Interactive Coding Platform</w:t>
-      </w:r>
-    </w:p>
-    <w:p>
-      <w:pPr>
-        <w:pStyle w:val="ListBullet"/>
-        <w:spacing w:after="60"/>
-        <w:rPr>
-          <w:rFonts w:ascii="Times New Roman" w:hAnsi="Times New Roman" w:cs="Times New Roman"/>
-        </w:rPr>
-      </w:pPr>
-      <w:r>
-        <w:rPr>
-          <w:rFonts w:ascii="Times New Roman" w:hAnsi="Times New Roman" w:cs="Times New Roman"/>
-          <w:b/>
-          <w:sz w:val="20"/>
-        </w:rPr>
-        <w:t>Description:</w:t>
-      </w:r>
-      <w:r>
-        <w:rPr>
-          <w:rFonts w:ascii="Times New Roman" w:hAnsi="Times New Roman" w:cs="Times New Roman"/>
-          <w:sz w:val="20"/>
-        </w:rPr>
-        <w:t xml:space="preserve"> Bilingual (Amharic/English) learning platform for C++ &amp; web fundamentals featuring structured interactive lessons, placement tests, g++ live browser compiler, AI tutor (Gemini/OpenAI), WebSockets, and Chapa payment integration.</w:t>
-      </w:r>
-    </w:p>
-    <w:p>
-      <w:pPr>
-        <w:pStyle w:val="ListBullet"/>
-        <w:spacing w:after="60"/>
-        <w:rPr>
-          <w:rFonts w:ascii="Times New Roman" w:hAnsi="Times New Roman" w:cs="Times New Roman"/>
-        </w:rPr>
-      </w:pPr>
-      <w:r>
-        <w:rPr>
-          <w:rFonts w:ascii="Times New Roman" w:hAnsi="Times New Roman" w:cs="Times New Roman"/>
-          <w:b/>
-          <w:sz w:val="20"/>
-        </w:rPr>
-        <w:t>Tech Stack:</w:t>
-      </w:r>
-      <w:r>
-        <w:rPr>
-          <w:rFonts w:ascii="Times New Roman" w:hAnsi="Times New Roman" w:cs="Times New Roman"/>
-          <w:sz w:val="20"/>
-        </w:rPr>
-        <w:t xml:space="preserve"> Next.js, React, TypeScript, Node.js, Express, MySQL, WebSockets, Gemini AI, g++ Compiler, Chapa Pay</w:t>
-      </w:r>
-    </w:p>
-    <w:p>
-      <w:pPr>
-        <w:pStyle w:val="ListBullet"/>
-        <w:spacing w:after="60"/>
-        <w:rPr>
-          <w:rFonts w:ascii="Times New Roman" w:hAnsi="Times New Roman" w:cs="Times New Roman"/>
-        </w:rPr>
-      </w:pPr>
-      <w:r/>
-      <w:r>
-        <w:t xml:space="preserve">Live Demo: </w:t>
-      </w:r>
-      <w:hyperlink r:id="rId13">
-        <w:r>
-          <w:rPr>
-            <w:color w:val="0066CC"/>
-            <w:u w:val="single"/>
-          </w:rPr>
-          <w:t>alpha-x-frontend.vercel.app</w:t>
-        </w:r>
-      </w:hyperlink>
-    </w:p>
-    <w:p>
-      <w:pPr>
-        <w:spacing w:before="120" w:after="40"/>
-        <w:rPr>
-          <w:rFonts w:ascii="Times New Roman" w:hAnsi="Times New Roman" w:cs="Times New Roman"/>
-        </w:rPr>
-      </w:pPr>
-      <w:r>
-        <w:rPr>
-          <w:rFonts w:ascii="Times New Roman" w:hAnsi="Times New Roman" w:cs="Times New Roman"/>
-          <w:b/>
-        </w:rPr>
-        <w:t>3. Askuala Link Official Platform</w:t>
-      </w:r>
-    </w:p>
-    <w:p>
-      <w:pPr>
-        <w:pStyle w:val="ListBullet"/>
-        <w:spacing w:after="60" w:before="0"/>
-        <w:rPr>
-          <w:rFonts w:ascii="Times New Roman" w:hAnsi="Times New Roman" w:cs="Times New Roman"/>
-        </w:rPr>
-      </w:pPr>
-      <w:r>
-        <w:rPr>
-          <w:rFonts w:ascii="Arial" w:hAnsi="Arial"/>
-          <w:color w:val="1F2937"/>
-          <w:sz w:val="20"/>
-        </w:rPr>
-        <w:t>Description: an AI powered Smart School system, collaborating with the development team to build and refine a high-performance, responsive experience. Implemented dynamic content experiences, modern UI improvements, SEO enhancements, and performance optimizations to deliver a polished, production-ready platform across devices.</w:t>
-      </w:r>
-    </w:p>
-    <w:p>
-      <w:pPr>
-        <w:pStyle w:val="ListBullet"/>
-        <w:spacing w:after="60"/>
-        <w:rPr>
-          <w:rFonts w:ascii="Times New Roman" w:hAnsi="Times New Roman" w:cs="Times New Roman"/>
-        </w:rPr>
-      </w:pPr>
-      <w:r>
-        <w:rPr>
-          <w:rFonts w:ascii="Times New Roman" w:hAnsi="Times New Roman" w:cs="Times New Roman"/>
-          <w:b/>
-          <w:sz w:val="20"/>
-        </w:rPr>
-        <w:t>Tech Stack:</w:t>
-      </w:r>
-      <w:r>
-        <w:rPr>
-          <w:rFonts w:ascii="Times New Roman" w:hAnsi="Times New Roman" w:cs="Times New Roman"/>
-          <w:sz w:val="20"/>
-        </w:rPr>
-        <w:t xml:space="preserve"> React, Next.js, Tailwind CSS, JavaScript, SEO (Meta/OpenGraph), Core Web Vitals, REST APIs</w:t>
-      </w:r>
-    </w:p>
-    <w:p>
-      <w:pPr>
-        <w:pStyle w:val="ListBullet"/>
-        <w:spacing w:after="60"/>
-        <w:rPr>
-          <w:rFonts w:ascii="Times New Roman" w:hAnsi="Times New Roman" w:cs="Times New Roman"/>
-        </w:rPr>
-      </w:pPr>
-      <w:r/>
-      <w:r>
-        <w:t xml:space="preserve">Live Demo: </w:t>
-      </w:r>
-      <w:hyperlink r:id="rId14">
-        <w:r>
-          <w:rPr>
-            <w:color w:val="0066CC"/>
-            <w:u w:val="single"/>
-          </w:rPr>
-          <w:t>askualalink.com</w:t>
-        </w:r>
-      </w:hyperlink>
-    </w:p>
-    <w:p>
-      <w:pPr>
-        <w:spacing w:before="120" w:after="40"/>
-        <w:rPr>
-          <w:rFonts w:ascii="Times New Roman" w:hAnsi="Times New Roman" w:cs="Times New Roman"/>
-        </w:rPr>
-      </w:pPr>
-      <w:r>
-        <w:rPr>
-          <w:rFonts w:ascii="Times New Roman" w:hAnsi="Times New Roman" w:cs="Times New Roman"/>
-          <w:b/>
-        </w:rPr>
-        <w:t>4. Tenashi AI Health Monitor</w:t>
-      </w:r>
-    </w:p>
-    <w:p>
-      <w:pPr>
-        <w:pStyle w:val="ListBullet"/>
-        <w:spacing w:after="60"/>
-        <w:rPr>
-          <w:rFonts w:ascii="Times New Roman" w:hAnsi="Times New Roman" w:cs="Times New Roman"/>
-        </w:rPr>
-      </w:pPr>
-      <w:r>
-        <w:rPr>
-          <w:rFonts w:ascii="Times New Roman" w:hAnsi="Times New Roman" w:cs="Times New Roman"/>
-          <w:b/>
-          <w:sz w:val="20"/>
-        </w:rPr>
-        <w:t>Description:</w:t>
-      </w:r>
-      <w:r>
-        <w:rPr>
-          <w:rFonts w:ascii="Times New Roman" w:hAnsi="Times New Roman" w:cs="Times New Roman"/>
-          <w:sz w:val="20"/>
-        </w:rPr>
-        <w:t xml:space="preserve"> AI-driven health monitoring application featuring scikit-learn IsolationForest anomaly detection, NumPy/Pandas real-time metrics processing, and Docker containerized services.</w:t>
-      </w:r>
-    </w:p>
-    <w:p>
-      <w:pPr>
-        <w:pStyle w:val="ListBullet"/>
-        <w:spacing w:after="60"/>
-        <w:rPr>
-          <w:rFonts w:ascii="Times New Roman" w:hAnsi="Times New Roman" w:cs="Times New Roman"/>
-        </w:rPr>
-      </w:pPr>
-      <w:r>
-        <w:rPr>
-          <w:rFonts w:ascii="Times New Roman" w:hAnsi="Times New Roman" w:cs="Times New Roman"/>
-          <w:b/>
-          <w:sz w:val="20"/>
-        </w:rPr>
-        <w:t>Tech Stack:</w:t>
-      </w:r>
-      <w:r>
-        <w:rPr>
-          <w:rFonts w:ascii="Times New Roman" w:hAnsi="Times New Roman" w:cs="Times New Roman"/>
-          <w:sz w:val="20"/>
-        </w:rPr>
-        <w:t xml:space="preserve"> React, Vite, Chart.js, Python, Flask, scikit-learn, NumPy, Pandas, Docker</w:t>
-      </w:r>
-    </w:p>
-    <w:p>
-      <w:pPr>
-        <w:spacing w:before="120" w:after="40"/>
-        <w:rPr>
-          <w:rFonts w:ascii="Times New Roman" w:hAnsi="Times New Roman" w:cs="Times New Roman"/>
-        </w:rPr>
-      </w:pPr>
-      <w:r>
-        <w:rPr>
-          <w:rFonts w:ascii="Times New Roman" w:hAnsi="Times New Roman" w:cs="Times New Roman"/>
-          <w:b/>
-        </w:rPr>
-        <w:t>5. Askuala Wiki</w:t>
-      </w:r>
-    </w:p>
-    <w:p>
-      <w:pPr>
-        <w:pStyle w:val="ListBullet"/>
-        <w:spacing w:after="60"/>
-        <w:rPr>
-          <w:rFonts w:ascii="Times New Roman" w:hAnsi="Times New Roman" w:cs="Times New Roman"/>
-        </w:rPr>
-      </w:pPr>
-      <w:r>
-        <w:rPr>
-          <w:rFonts w:ascii="Times New Roman" w:hAnsi="Times New Roman" w:cs="Times New Roman"/>
-          <w:b/>
-          <w:sz w:val="20"/>
-        </w:rPr>
-        <w:t>Description:</w:t>
-      </w:r>
-      <w:r>
-        <w:rPr>
-          <w:rFonts w:ascii="Times New Roman" w:hAnsi="Times New Roman" w:cs="Times New Roman"/>
-          <w:sz w:val="20"/>
-        </w:rPr>
-        <w:t xml:space="preserve"> High-performance internal knowledge wiki engineered with React 19, Zustand state store, Node.js REST APIs, and Cloudinary media pipelines.</w:t>
-      </w:r>
-    </w:p>
-    <w:p>
-      <w:pPr>
-        <w:pStyle w:val="ListBullet"/>
-        <w:spacing w:after="60"/>
-        <w:rPr>
-          <w:rFonts w:ascii="Times New Roman" w:hAnsi="Times New Roman" w:cs="Times New Roman"/>
-        </w:rPr>
-      </w:pPr>
-      <w:r>
-        <w:rPr>
-          <w:rFonts w:ascii="Times New Roman" w:hAnsi="Times New Roman" w:cs="Times New Roman"/>
-          <w:b/>
-          <w:sz w:val="20"/>
-        </w:rPr>
-        <w:t>Tech Stack:</w:t>
-      </w:r>
-      <w:r>
-        <w:rPr>
-          <w:rFonts w:ascii="Times New Roman" w:hAnsi="Times New Roman" w:cs="Times New Roman"/>
-          <w:sz w:val="20"/>
-        </w:rPr>
-        <w:t xml:space="preserve"> React 19, Tailwind CSS v4, Zustand, Node.js, Express.js, MySQL, Sequelize, Cloudinary</w:t>
-      </w:r>
-    </w:p>
-    <w:p>
-      <w:pPr>
-        <w:spacing w:before="120" w:after="40"/>
-        <w:rPr>
-          <w:rFonts w:ascii="Times New Roman" w:hAnsi="Times New Roman" w:cs="Times New Roman"/>
-        </w:rPr>
-      </w:pPr>
-      <w:r>
-        <w:rPr>
-          <w:rFonts w:ascii="Times New Roman" w:hAnsi="Times New Roman" w:cs="Times New Roman"/>
-          <w:b/>
-        </w:rPr>
-        <w:t>6. Yene Temari (Top 10 Finalist — Innovation for Peace 2025)</w:t>
-      </w:r>
-    </w:p>
-    <w:p>
-      <w:pPr>
-        <w:pStyle w:val="ListBullet"/>
-        <w:spacing w:after="60"/>
-        <w:rPr>
-          <w:rFonts w:ascii="Times New Roman" w:hAnsi="Times New Roman" w:cs="Times New Roman"/>
-        </w:rPr>
-      </w:pPr>
-      <w:r>
-        <w:rPr>
-          <w:rFonts w:ascii="Times New Roman" w:hAnsi="Times New Roman" w:cs="Times New Roman"/>
-          <w:b/>
-          <w:sz w:val="20"/>
-        </w:rPr>
-        <w:t>Description:</w:t>
-      </w:r>
-      <w:r>
-        <w:rPr>
-          <w:rFonts w:ascii="Times New Roman" w:hAnsi="Times New Roman" w:cs="Times New Roman"/>
-          <w:sz w:val="20"/>
-        </w:rPr>
-        <w:t xml:space="preserve"> AI-assisted tutoring platform providing intelligent tutor matching, profile verification, and student learning analytics.</w:t>
-      </w:r>
-    </w:p>
-    <w:p>
-      <w:pPr>
-        <w:pStyle w:val="ListBullet"/>
-        <w:spacing w:after="60"/>
-        <w:rPr>
-          <w:rFonts w:ascii="Times New Roman" w:hAnsi="Times New Roman" w:cs="Times New Roman"/>
-        </w:rPr>
-      </w:pPr>
-      <w:r>
-        <w:rPr>
-          <w:rFonts w:ascii="Times New Roman" w:hAnsi="Times New Roman" w:cs="Times New Roman"/>
-          <w:b/>
-          <w:sz w:val="20"/>
-        </w:rPr>
-        <w:t>Tech Stack:</w:t>
-      </w:r>
-      <w:r>
-        <w:rPr>
-          <w:rFonts w:ascii="Times New Roman" w:hAnsi="Times New Roman" w:cs="Times New Roman"/>
-          <w:sz w:val="20"/>
-        </w:rPr>
-        <w:t xml:space="preserve"> Python, React, AI Matching Algorithms, REST APIs</w:t>
-      </w:r>
-    </w:p>
-    <w:p>
-      <w:pPr>
-        <w:spacing w:before="120" w:after="40"/>
-        <w:rPr>
-          <w:rFonts w:ascii="Times New Roman" w:hAnsi="Times New Roman" w:cs="Times New Roman"/>
-        </w:rPr>
-      </w:pPr>
-      <w:r>
-        <w:rPr>
-          <w:rFonts w:ascii="Times New Roman" w:hAnsi="Times New Roman" w:cs="Times New Roman"/>
-          <w:b/>
-        </w:rPr>
-        <w:t>7. Hintern Bridge Internship Platform Backend</w:t>
-      </w:r>
-    </w:p>
-    <w:p>
-      <w:pPr>
-        <w:pStyle w:val="ListBullet"/>
-        <w:spacing w:after="60"/>
-        <w:rPr>
-          <w:rFonts w:ascii="Times New Roman" w:hAnsi="Times New Roman" w:cs="Times New Roman"/>
-        </w:rPr>
-      </w:pPr>
-      <w:r>
-        <w:rPr>
-          <w:rFonts w:ascii="Times New Roman" w:hAnsi="Times New Roman" w:cs="Times New Roman"/>
-          <w:b/>
-          <w:sz w:val="20"/>
-        </w:rPr>
-        <w:t>Description:</w:t>
-      </w:r>
-      <w:r>
-        <w:rPr>
-          <w:rFonts w:ascii="Times New Roman" w:hAnsi="Times New Roman" w:cs="Times New Roman"/>
-          <w:sz w:val="20"/>
-        </w:rPr>
-        <w:t xml:space="preserve"> Production backend infrastructure handling student application pipelines, recruiter portals, and matching algorithms.</w:t>
-      </w:r>
-    </w:p>
-    <w:p>
-      <w:pPr>
-        <w:pStyle w:val="ListBullet"/>
-        <w:spacing w:after="60"/>
-        <w:rPr>
-          <w:rFonts w:ascii="Times New Roman" w:hAnsi="Times New Roman" w:cs="Times New Roman"/>
-        </w:rPr>
-      </w:pPr>
-      <w:r>
-        <w:rPr>
-          <w:rFonts w:ascii="Times New Roman" w:hAnsi="Times New Roman" w:cs="Times New Roman"/>
-          <w:b/>
-          <w:sz w:val="20"/>
-        </w:rPr>
-        <w:t>Tech Stack:</w:t>
-      </w:r>
-      <w:r>
-        <w:rPr>
-          <w:rFonts w:ascii="Times New Roman" w:hAnsi="Times New Roman" w:cs="Times New Roman"/>
-          <w:sz w:val="20"/>
-        </w:rPr>
-        <w:t xml:space="preserve"> Node.js, Express.js, REST APIs, MySQL</w:t>
-      </w:r>
-    </w:p>
-    <w:p>
-      <w:pPr>
-        <w:spacing w:before="240" w:after="80"/>
-        <w:rPr>
-          <w:rFonts w:ascii="Times New Roman" w:hAnsi="Times New Roman" w:cs="Times New Roman"/>
-        </w:rPr>
-      </w:pPr>
-      <w:r>
-        <w:rPr>
-          <w:rFonts w:ascii="Times New Roman" w:hAnsi="Times New Roman" w:cs="Times New Roman"/>
-          <w:b/>
-          <w:sz w:val="26"/>
-        </w:rPr>
-        <w:t>COMMUNITY IMPACT &amp; EXTRACURRICULAR LEADERSHIP</w:t>
-      </w:r>
-    </w:p>
-    <w:p>
-      <w:pPr>
-        <w:pStyle w:val="ListBullet"/>
-        <w:spacing w:after="60"/>
-        <w:rPr>
-          <w:rFonts w:ascii="Times New Roman" w:hAnsi="Times New Roman" w:cs="Times New Roman"/>
-        </w:rPr>
-      </w:pPr>
-      <w:r/>
-      <w:r>
-        <w:t>Founder &amp; Community Lead — Meta Codz (BiT) (</w:t>
-      </w:r>
-      <w:r>
-        <w:rPr>
-          <w:i/>
-        </w:rPr>
-        <w:t>Jun 2025 — Jun 2026</w:t>
-      </w:r>
-      <w:r>
-        <w:t>): Founded and led a thriving student technology community at Bahir Dar Institute of Technology. Organized technical workshops, guest lectures, expert interviews, and multidisciplinary project showcase events for 100+ student developers.</w:t>
-      </w:r>
-    </w:p>
-    <w:p>
-      <w:pPr>
-        <w:pStyle w:val="ListBullet"/>
-        <w:spacing w:after="60"/>
-        <w:rPr>
-          <w:rFonts w:ascii="Times New Roman" w:hAnsi="Times New Roman" w:cs="Times New Roman"/>
-        </w:rPr>
-      </w:pPr>
-      <w:r/>
-      <w:r>
-        <w:t>Hackathon Organizer — Cursor Hackathon (</w:t>
-      </w:r>
-      <w:r>
-        <w:rPr>
-          <w:i/>
-        </w:rPr>
-        <w:t>Oct — Nov 2025</w:t>
-      </w:r>
-      <w:r>
-        <w:t>): Co-organized an international-scale hackathon at Bahir Dar University. Coordinated logistics, participant mentorship, jury evaluation criteria, university leadership relations, and industry partnerships.</w:t>
-      </w:r>
-    </w:p>
-    <w:p>
-      <w:pPr>
-        <w:pStyle w:val="ListBullet"/>
-        <w:spacing w:after="60"/>
-        <w:rPr>
-          <w:rFonts w:ascii="Times New Roman" w:hAnsi="Times New Roman" w:cs="Times New Roman"/>
-        </w:rPr>
-      </w:pPr>
-      <w:r/>
-      <w:r>
-        <w:t>Web Development Mentor — Eshet Academy (</w:t>
-      </w:r>
-      <w:r>
-        <w:rPr>
-          <w:i/>
-        </w:rPr>
-        <w:t>Mar — May 2025</w:t>
-      </w:r>
-      <w:r>
-        <w:t>): Mentored high school students during a 3-month intensive coding bootcamp. Guided teams in building real-world applications including school management portals and student club registration systems.</w:t>
-      </w:r>
-    </w:p>
-    <w:p>
-      <w:pPr>
-        <w:spacing w:before="120" w:after="40"/>
-        <w:rPr>
-          <w:rFonts w:ascii="Times New Roman" w:hAnsi="Times New Roman" w:cs="Times New Roman"/>
-        </w:rPr>
-      </w:pPr>
-      <w:r>
-        <w:rPr>
-          <w:rFonts w:ascii="Times New Roman" w:hAnsi="Times New Roman" w:cs="Times New Roman"/>
-          <w:b/>
-        </w:rPr>
-        <w:lastRenderedPageBreak/>
-        <w:t>Honors &amp; Recognitions</w:t>
-      </w:r>
-    </w:p>
-    <w:p>
-      <w:pPr>
-        <w:pStyle w:val="ListBullet"/>
-        <w:spacing w:after="60"/>
-        <w:rPr>
-          <w:rFonts w:ascii="Times New Roman" w:hAnsi="Times New Roman" w:cs="Times New Roman"/>
-        </w:rPr>
-      </w:pPr>
-      <w:r/>
-      <w:r>
-        <w:t xml:space="preserve">🏆 Best Top 3 Internship Project of 2025 — </w:t>
-      </w:r>
-      <w:r>
-        <w:rPr>
-          <w:i/>
-        </w:rPr>
-        <w:t>Bahir Dar University</w:t>
-      </w:r>
-    </w:p>
-    <w:p>
-      <w:pPr>
-        <w:pStyle w:val="ListBullet"/>
-        <w:spacing w:after="60"/>
-        <w:rPr>
-          <w:rFonts w:ascii="Times New Roman" w:hAnsi="Times New Roman" w:cs="Times New Roman"/>
-        </w:rPr>
-      </w:pPr>
-      <w:r/>
-      <w:r>
-        <w:t xml:space="preserve">🥇 3rd Place Winner — </w:t>
-      </w:r>
-      <w:r>
-        <w:rPr>
-          <w:i/>
-        </w:rPr>
-        <w:t>BiT AI Hackathon (Computing Association - BiT)</w:t>
-      </w:r>
-    </w:p>
-    <w:p>
-      <w:pPr>
-        <w:pStyle w:val="ListBullet"/>
-        <w:spacing w:after="60"/>
-        <w:rPr>
-          <w:rFonts w:ascii="Times New Roman" w:hAnsi="Times New Roman" w:cs="Times New Roman"/>
-        </w:rPr>
-      </w:pPr>
-      <w:r/>
-      <w:r>
-        <w:t xml:space="preserve">🏅 Top 10 Finalist — </w:t>
-      </w:r>
-      <w:r>
-        <w:rPr>
-          <w:i/>
-        </w:rPr>
-        <w:t>Innovation for Peace 2025 (Bahir Dar University)</w:t>
-      </w:r>
-    </w:p>
-    <w:p>
-      <w:pPr>
-        <w:pStyle w:val="ListBullet"/>
-        <w:spacing w:after="60"/>
-        <w:rPr>
-          <w:rFonts w:ascii="Times New Roman" w:hAnsi="Times New Roman" w:cs="Times New Roman"/>
-        </w:rPr>
-      </w:pPr>
-      <w:r/>
-      <w:r>
-        <w:t xml:space="preserve">📜 PLP Software Development Scholar — </w:t>
-      </w:r>
-      <w:r>
-        <w:rPr>
-          <w:i/>
-        </w:rPr>
-        <w:t>Power Learn Project</w:t>
-      </w:r>
     </w:p>
     <w:sectPr>
+      <w:footerReference w:type="default" r:id="rId20"/>
       <w:pgSz w:w="12240" w:h="15840"/>
-      <w:pgMar w:top="1080" w:right="1080" w:bottom="1080" w:left="1080" w:header="720" w:footer="720" w:gutter="0"/>
+      <w:pgMar w:top="648" w:right="936" w:bottom="648" w:left="936" w:header="720" w:footer="720" w:gutter="0"/>
       <w:cols w:space="720"/>
       <w:docGrid w:linePitch="360"/>
     </w:sectPr>
   </w:body>
 </w:document>
+</file>
+
+<file path=word/endnotes.xml><?xml version="1.0" encoding="utf-8"?>
+<w:endnotes xmlns:wpc="http://schemas.microsoft.com/office/word/2010/wordprocessingCanvas" xmlns:cx="http://schemas.microsoft.com/office/drawing/2014/chartex" xmlns:mc="http://schemas.openxmlformats.org/markup-compatibility/2006" xmlns:o="urn:schemas-microsoft-com:office:office" xmlns:r="http://schemas.openxmlformats.org/officeDocument/2006/relationships" xmlns:m="http://schemas.openxmlformats.org/officeDocument/2006/math" xmlns:v="urn:schemas-microsoft-com:vml" xmlns:wp14="http://schemas.microsoft.com/office/word/2010/wordprocessingDrawing" xmlns:wp="http://schemas.openxmlformats.org/drawingml/2006/wordprocessingDrawing" xmlns:w10="urn:schemas-microsoft-com:office:word" xmlns:w="http://schemas.openxmlformats.org/wordprocessingml/2006/main" xmlns:w14="http://schemas.microsoft.com/office/word/2010/wordml" xmlns:w15="http://schemas.microsoft.com/office/word/2012/wordml" xmlns:w16se="http://schemas.microsoft.com/office/word/2015/wordml/symex" xmlns:wpg="http://schemas.microsoft.com/office/word/2010/wordprocessingGroup" xmlns:wpi="http://schemas.microsoft.com/office/word/2010/wordprocessingInk" xmlns:wne="http://schemas.microsoft.com/office/word/2006/wordml" xmlns:wps="http://schemas.microsoft.com/office/word/2010/wordprocessingShape" mc:Ignorable="w14 w15 w16se wp14">
+  <w:endnote w:type="separator" w:id="-1">
+    <w:p>
+      <w:pPr>
+        <w:spacing w:after="0"/>
+      </w:pPr>
+      <w:r>
+        <w:separator/>
+      </w:r>
+    </w:p>
+  </w:endnote>
+  <w:endnote w:type="continuationSeparator" w:id="0">
+    <w:p>
+      <w:pPr>
+        <w:spacing w:after="0"/>
+      </w:pPr>
+      <w:r>
+        <w:continuationSeparator/>
+      </w:r>
+    </w:p>
+  </w:endnote>
+</w:endnotes>
+</file>
+
+<file path=word/footer1.xml><?xml version="1.0" encoding="utf-8"?>
+<w:ftr xmlns:wpc="http://schemas.microsoft.com/office/word/2010/wordprocessingCanvas" xmlns:cx="http://schemas.microsoft.com/office/drawing/2014/chartex" xmlns:mc="http://schemas.openxmlformats.org/markup-compatibility/2006" xmlns:o="urn:schemas-microsoft-com:office:office" xmlns:r="http://schemas.openxmlformats.org/officeDocument/2006/relationships" xmlns:m="http://schemas.openxmlformats.org/officeDocument/2006/math" xmlns:v="urn:schemas-microsoft-com:vml" xmlns:wp14="http://schemas.microsoft.com/office/word/2010/wordprocessingDrawing" xmlns:wp="http://schemas.openxmlformats.org/drawingml/2006/wordprocessingDrawing" xmlns:w10="urn:schemas-microsoft-com:office:word" xmlns:w="http://schemas.openxmlformats.org/wordprocessingml/2006/main" xmlns:w14="http://schemas.microsoft.com/office/word/2010/wordml" xmlns:w15="http://schemas.microsoft.com/office/word/2012/wordml" xmlns:w16se="http://schemas.microsoft.com/office/word/2015/wordml/symex" xmlns:wpg="http://schemas.microsoft.com/office/word/2010/wordprocessingGroup" xmlns:wpi="http://schemas.microsoft.com/office/word/2010/wordprocessingInk" xmlns:wne="http://schemas.microsoft.com/office/word/2006/wordml" xmlns:wps="http://schemas.microsoft.com/office/word/2010/wordprocessingShape" mc:Ignorable="w14 w15 w16se wp14">
+  <w:p>
+    <w:pPr>
+      <w:pStyle w:val="Footer"/>
+    </w:pPr>
+    <w:r>
+      <w:t>Last updated: Sep 2026</w:t>
+    </w:r>
+  </w:p>
+  <w:p>
+    <w:pPr>
+      <w:pStyle w:val="Footer"/>
+    </w:pPr>
+  </w:p>
+</w:ftr>
+</file>
+
+<file path=word/footnotes.xml><?xml version="1.0" encoding="utf-8"?>
+<w:footnotes xmlns:wpc="http://schemas.microsoft.com/office/word/2010/wordprocessingCanvas" xmlns:cx="http://schemas.microsoft.com/office/drawing/2014/chartex" xmlns:mc="http://schemas.openxmlformats.org/markup-compatibility/2006" xmlns:o="urn:schemas-microsoft-com:office:office" xmlns:r="http://schemas.openxmlformats.org/officeDocument/2006/relationships" xmlns:m="http://schemas.openxmlformats.org/officeDocument/2006/math" xmlns:v="urn:schemas-microsoft-com:vml" xmlns:wp14="http://schemas.microsoft.com/office/word/2010/wordprocessingDrawing" xmlns:wp="http://schemas.openxmlformats.org/drawingml/2006/wordprocessingDrawing" xmlns:w10="urn:schemas-microsoft-com:office:word" xmlns:w="http://schemas.openxmlformats.org/wordprocessingml/2006/main" xmlns:w14="http://schemas.microsoft.com/office/word/2010/wordml" xmlns:w15="http://schemas.microsoft.com/office/word/2012/wordml" xmlns:w16se="http://schemas.microsoft.com/office/word/2015/wordml/symex" xmlns:wpg="http://schemas.microsoft.com/office/word/2010/wordprocessingGroup" xmlns:wpi="http://schemas.microsoft.com/office/word/2010/wordprocessingInk" xmlns:wne="http://schemas.microsoft.com/office/word/2006/wordml" xmlns:wps="http://schemas.microsoft.com/office/word/2010/wordprocessingShape" mc:Ignorable="w14 w15 w16se wp14">
+  <w:footnote w:type="separator" w:id="-1">
+    <w:p>
+      <w:pPr>
+        <w:spacing w:after="0"/>
+      </w:pPr>
+      <w:r>
+        <w:separator/>
+      </w:r>
+    </w:p>
+  </w:footnote>
+  <w:footnote w:type="continuationSeparator" w:id="0">
+    <w:p>
+      <w:pPr>
+        <w:spacing w:after="0"/>
+      </w:pPr>
+      <w:r>
+        <w:continuationSeparator/>
+      </w:r>
+    </w:p>
+  </w:footnote>
+</w:footnotes>
 </file>
 
 <file path=word/numbering.xml><?xml version="1.0" encoding="utf-8"?>
@@ -2471,7 +2409,7 @@
   <w:abstractNum w:abstractNumId="8" w15:restartNumberingAfterBreak="0">
     <w:nsid w:val="FFFFFF89"/>
     <w:multiLevelType w:val="singleLevel"/>
-    <w:tmpl w:val="605E73F6"/>
+    <w:tmpl w:val="29761A62"/>
     <w:lvl w:ilvl="0">
       <w:start w:val="1"/>
       <w:numFmt w:val="bullet"/>
@@ -2903,7 +2841,14 @@
   <w:style w:type="paragraph" w:default="1" w:styleId="Normal">
     <w:name w:val="Normal"/>
     <w:qFormat/>
-    <w:rsid w:val="00FC693F"/>
+    <w:rsid w:val="001E7500"/>
+    <w:pPr>
+      <w:spacing w:after="40" w:line="240" w:lineRule="auto"/>
+    </w:pPr>
+    <w:rPr>
+      <w:rFonts w:ascii="Arial" w:hAnsi="Arial"/>
+      <w:sz w:val="18"/>
+    </w:rPr>
   </w:style>
   <w:style w:type="paragraph" w:styleId="Heading1">
     <w:name w:val="heading 1"/>
@@ -2916,7 +2861,7 @@
     <w:pPr>
       <w:keepNext/>
       <w:keepLines/>
-      <w:spacing w:before="480" w:after="0"/>
+      <w:spacing w:before="100"/>
       <w:outlineLvl w:val="0"/>
     </w:pPr>
     <w:rPr>
@@ -2924,7 +2869,7 @@
       <w:b/>
       <w:bCs/>
       <w:color w:val="365F91" w:themeColor="accent1" w:themeShade="BF"/>
-      <w:sz w:val="28"/>
+      <w:sz w:val="22"/>
       <w:szCs w:val="28"/>
     </w:rPr>
   </w:style>
@@ -3117,6 +3062,7 @@
   <w:style w:type="character" w:default="1" w:styleId="DefaultParagraphFont">
     <w:name w:val="Default Paragraph Font"/>
     <w:uiPriority w:val="1"/>
+    <w:semiHidden/>
     <w:unhideWhenUsed/>
   </w:style>
   <w:style w:type="table" w:default="1" w:styleId="TableNormal">
@@ -3152,7 +3098,7 @@
         <w:tab w:val="center" w:pos="4680"/>
         <w:tab w:val="right" w:pos="9360"/>
       </w:tabs>
-      <w:spacing w:after="0" w:line="240" w:lineRule="auto"/>
+      <w:spacing w:after="0"/>
     </w:pPr>
   </w:style>
   <w:style w:type="character" w:customStyle="1" w:styleId="HeaderChar">
@@ -3174,7 +3120,7 @@
         <w:tab w:val="center" w:pos="4680"/>
         <w:tab w:val="right" w:pos="9360"/>
       </w:tabs>
-      <w:spacing w:after="0" w:line="240" w:lineRule="auto"/>
+      <w:spacing w:after="0"/>
     </w:pPr>
   </w:style>
   <w:style w:type="character" w:customStyle="1" w:styleId="FooterChar">
@@ -3248,7 +3194,7 @@
       <w:pBdr>
         <w:bottom w:val="single" w:sz="8" w:space="4" w:color="4F81BD" w:themeColor="accent1"/>
       </w:pBdr>
-      <w:spacing w:after="300" w:line="240" w:lineRule="auto"/>
+      <w:spacing w:after="300"/>
       <w:contextualSpacing/>
     </w:pPr>
     <w:rPr>
@@ -3690,14 +3636,10 @@
     <w:unhideWhenUsed/>
     <w:qFormat/>
     <w:rsid w:val="00FC693F"/>
-    <w:pPr>
-      <w:spacing w:line="240" w:lineRule="auto"/>
-    </w:pPr>
     <w:rPr>
       <w:b/>
       <w:bCs/>
       <w:color w:val="4F81BD" w:themeColor="accent1"/>
-      <w:sz w:val="18"/>
       <w:szCs w:val="18"/>
     </w:rPr>
   </w:style>
@@ -13892,6 +13834,30 @@
         <w:shd w:val="clear" w:color="auto" w:fill="FBCAA2" w:themeFill="accent6" w:themeFillTint="7F"/>
       </w:tcPr>
     </w:tblStylePr>
+  </w:style>
+  <w:style w:type="character" w:styleId="Hyperlink">
+    <w:name w:val="Hyperlink"/>
+    <w:basedOn w:val="DefaultParagraphFont"/>
+    <w:uiPriority w:val="99"/>
+    <w:unhideWhenUsed/>
+    <w:rsid w:val="001E7500"/>
+    <w:rPr>
+      <w:color w:val="0000FF" w:themeColor="hyperlink"/>
+      <w:u w:val="single"/>
+    </w:rPr>
+  </w:style>
+  <w:style w:type="paragraph" w:styleId="NormalWeb">
+    <w:name w:val="Normal (Web)"/>
+    <w:basedOn w:val="Normal"/>
+    <w:uiPriority w:val="99"/>
+    <w:semiHidden/>
+    <w:unhideWhenUsed/>
+    <w:rsid w:val="003D5980"/>
+    <w:rPr>
+      <w:rFonts w:ascii="Times New Roman" w:hAnsi="Times New Roman" w:cs="Times New Roman"/>
+      <w:sz w:val="24"/>
+      <w:szCs w:val="24"/>
+    </w:rPr>
   </w:style>
 </w:styles>
 </file>
@@ -14221,7 +14187,7 @@
 </file>
 
 <file path=customXml/itemProps1.xml><?xml version="1.0" encoding="utf-8"?>
-<ds:datastoreItem xmlns:ds="http://schemas.openxmlformats.org/officeDocument/2006/customXml" ds:itemID="{C6391956-5FFC-469E-8574-92A6CD0E6831}">
+<ds:datastoreItem xmlns:ds="http://schemas.openxmlformats.org/officeDocument/2006/customXml" ds:itemID="{3D06E570-8612-4B99-A115-129067695329}">
   <ds:schemaRefs>
     <ds:schemaRef ds:uri="http://schemas.openxmlformats.org/officeDocument/2006/bibliography"/>
   </ds:schemaRefs>

</xml_diff>